<commit_message>
territorio, solos e acréscimos de imagens
</commit_message>
<xml_diff>
--- a/models/DECLIVIDADE e PEDOLOGIA.docx
+++ b/models/DECLIVIDADE e PEDOLOGIA.docx
@@ -1,13 +1,12 @@
 
 <file path=word/document.xml><?xml version="1.0" encoding="utf-8"?>
-<w:document xmlns:wpc="http://schemas.microsoft.com/office/word/2010/wordprocessingCanvas" xmlns:cx="http://schemas.microsoft.com/office/drawing/2014/chartex" xmlns:cx1="http://schemas.microsoft.com/office/drawing/2015/9/8/chartex" xmlns:cx2="http://schemas.microsoft.com/office/drawing/2015/10/21/chartex" xmlns:cx3="http://schemas.microsoft.com/office/drawing/2016/5/9/chartex" xmlns:cx4="http://schemas.microsoft.com/office/drawing/2016/5/10/chartex" xmlns:cx5="http://schemas.microsoft.com/office/drawing/2016/5/11/chartex" xmlns:cx6="http://schemas.microsoft.com/office/drawing/2016/5/12/chartex" xmlns:cx7="http://schemas.microsoft.com/office/drawing/2016/5/13/chartex" xmlns:cx8="http://schemas.microsoft.com/office/drawing/2016/5/14/chartex" xmlns:mc="http://schemas.openxmlformats.org/markup-compatibility/2006" xmlns:aink="http://schemas.microsoft.com/office/drawing/2016/ink" xmlns:am3d="http://schemas.microsoft.com/office/drawing/2017/model3d" xmlns:o="urn:schemas-microsoft-com:office:office" xmlns:oel="http://schemas.microsoft.com/office/2019/extlst" xmlns:r="http://schemas.openxmlformats.org/officeDocument/2006/relationships" xmlns:m="http://schemas.openxmlformats.org/officeDocument/2006/math" xmlns:v="urn:schemas-microsoft-com:vml" xmlns:wp14="http://schemas.microsoft.com/office/word/2010/wordprocessingDrawing" xmlns:wp="http://schemas.openxmlformats.org/drawingml/2006/wordprocessingDrawing" xmlns:w10="urn:schemas-microsoft-com:office:word" xmlns:w="http://schemas.openxmlformats.org/wordprocessingml/2006/main" xmlns:w14="http://schemas.microsoft.com/office/word/2010/wordml" xmlns:w15="http://schemas.microsoft.com/office/word/2012/wordml" xmlns:w16cex="http://schemas.microsoft.com/office/word/2018/wordml/cex" xmlns:w16cid="http://schemas.microsoft.com/office/word/2016/wordml/cid" xmlns:w16="http://schemas.microsoft.com/office/word/2018/wordml" xmlns:w16du="http://schemas.microsoft.com/office/word/2023/wordml/word16du" xmlns:w16sdtdh="http://schemas.microsoft.com/office/word/2020/wordml/sdtdatahash" xmlns:w16sdtfl="http://schemas.microsoft.com/office/word/2024/wordml/sdtformatlock" xmlns:w16se="http://schemas.microsoft.com/office/word/2015/wordml/symex" xmlns:wpg="http://schemas.microsoft.com/office/word/2010/wordprocessingGroup" xmlns:wpi="http://schemas.microsoft.com/office/word/2010/wordprocessingInk" xmlns:wne="http://schemas.microsoft.com/office/word/2006/wordml" xmlns:wps="http://schemas.microsoft.com/office/word/2010/wordprocessingShape" mc:Ignorable="w14 w15 w16se w16cid w16 w16cex w16sdtdh w16sdtfl w16du wp14">
+<w:document xmlns:wpc="http://schemas.microsoft.com/office/word/2010/wordprocessingCanvas" xmlns:cx="http://schemas.microsoft.com/office/drawing/2014/chartex" xmlns:mc="http://schemas.openxmlformats.org/markup-compatibility/2006" xmlns:o="urn:schemas-microsoft-com:office:office" xmlns:r="http://schemas.openxmlformats.org/officeDocument/2006/relationships" xmlns:m="http://schemas.openxmlformats.org/officeDocument/2006/math" xmlns:v="urn:schemas-microsoft-com:vml" xmlns:wp14="http://schemas.microsoft.com/office/word/2010/wordprocessingDrawing" xmlns:wp="http://schemas.openxmlformats.org/drawingml/2006/wordprocessingDrawing" xmlns:w10="urn:schemas-microsoft-com:office:word" xmlns:w="http://schemas.openxmlformats.org/wordprocessingml/2006/main" xmlns:w14="http://schemas.microsoft.com/office/word/2010/wordml" xmlns:w15="http://schemas.microsoft.com/office/word/2012/wordml" xmlns:w16se="http://schemas.microsoft.com/office/word/2015/wordml/symex" xmlns:wpg="http://schemas.microsoft.com/office/word/2010/wordprocessingGroup" xmlns:wpi="http://schemas.microsoft.com/office/word/2010/wordprocessingInk" xmlns:wne="http://schemas.microsoft.com/office/word/2006/wordml" xmlns:wps="http://schemas.microsoft.com/office/word/2010/wordprocessingShape" mc:Ignorable="w14 w15 w16se wp14">
   <w:body>
-    <w:bookmarkStart w:id="0" w:name="_MON_1747645272"/>
-    <w:bookmarkEnd w:id="0"/>
-    <w:p>
-      <w:pPr>
-        <w:spacing w:line="360" w:lineRule="auto"/>
-        <w:jc w:val="both"/>
+    <w:bookmarkStart w:id="0" w:name="_GoBack"/>
+    <w:bookmarkStart w:id="1" w:name="_MON_1747645272"/>
+    <w:bookmarkEnd w:id="1"/>
+    <w:p>
+      <w:pPr>
         <w:rPr>
           <w:rFonts w:ascii="Times New Roman" w:hAnsi="Times New Roman" w:cs="Times New Roman"/>
           <w:b/>
@@ -44,15 +43,15 @@
             <v:path o:extrusionok="f" gradientshapeok="t" o:connecttype="rect"/>
             <o:lock v:ext="edit" aspectratio="t"/>
           </v:shapetype>
-          <v:shape id="_x0000_i1025" type="#_x0000_t75" style="width:426pt;height:697.5pt" o:ole="">
+          <v:shape id="_x0000_i1030" type="#_x0000_t75" style="width:425.25pt;height:697.5pt" o:ole="">
             <v:imagedata r:id="rId6" o:title=""/>
           </v:shape>
-          <o:OLEObject Type="Embed" ProgID="Word.Document.12" ShapeID="_x0000_i1025" DrawAspect="Content" ObjectID="_1797920990" r:id="rId7">
+          <o:OLEObject Type="Embed" ProgID="Word.Document.12" ShapeID="_x0000_i1030" DrawAspect="Content" ObjectID="_1807448648" r:id="rId7">
             <o:FieldCodes>\s</o:FieldCodes>
           </o:OLEObject>
         </w:object>
       </w:r>
-      <w:proofErr w:type="spellStart"/>
+      <w:bookmarkEnd w:id="0"/>
       <w:r>
         <w:rPr>
           <w:rFonts w:ascii="Times New Roman" w:hAnsi="Times New Roman" w:cs="Times New Roman"/>
@@ -62,19 +61,7 @@
           <w:sz w:val="24"/>
           <w:szCs w:val="24"/>
         </w:rPr>
-        <w:t>Argissolos</w:t>
-      </w:r>
-      <w:proofErr w:type="spellEnd"/>
-      <w:r>
-        <w:rPr>
-          <w:rFonts w:ascii="Times New Roman" w:hAnsi="Times New Roman" w:cs="Times New Roman"/>
-          <w:b/>
-          <w:bCs/>
-          <w:color w:val="FF0000"/>
-          <w:sz w:val="24"/>
-          <w:szCs w:val="24"/>
-        </w:rPr>
-        <w:t xml:space="preserve"> - P</w:t>
+        <w:t>Argissolos - P</w:t>
       </w:r>
       <w:r>
         <w:rPr>
@@ -91,97 +78,7 @@
           <w:sz w:val="24"/>
           <w:szCs w:val="24"/>
         </w:rPr>
-        <w:t xml:space="preserve">Solos que apresentam horizonte B </w:t>
-      </w:r>
-      <w:proofErr w:type="spellStart"/>
-      <w:r>
-        <w:rPr>
-          <w:rFonts w:ascii="Times New Roman" w:hAnsi="Times New Roman" w:cs="Times New Roman"/>
-          <w:sz w:val="24"/>
-          <w:szCs w:val="24"/>
-        </w:rPr>
-        <w:t>textural</w:t>
-      </w:r>
-      <w:proofErr w:type="spellEnd"/>
-      <w:r>
-        <w:rPr>
-          <w:rFonts w:ascii="Times New Roman" w:hAnsi="Times New Roman" w:cs="Times New Roman"/>
-          <w:sz w:val="24"/>
-          <w:szCs w:val="24"/>
-        </w:rPr>
-        <w:t xml:space="preserve"> com argila de atividade baixa imediatamente abaixo do horizonte A ou E. Se apresentar horizonte </w:t>
-      </w:r>
-      <w:proofErr w:type="spellStart"/>
-      <w:r>
-        <w:rPr>
-          <w:rFonts w:ascii="Times New Roman" w:hAnsi="Times New Roman" w:cs="Times New Roman"/>
-          <w:sz w:val="24"/>
-          <w:szCs w:val="24"/>
-        </w:rPr>
-        <w:t>plíntico</w:t>
-      </w:r>
-      <w:proofErr w:type="spellEnd"/>
-      <w:r>
-        <w:rPr>
-          <w:rFonts w:ascii="Times New Roman" w:hAnsi="Times New Roman" w:cs="Times New Roman"/>
-          <w:sz w:val="24"/>
-          <w:szCs w:val="24"/>
-        </w:rPr>
-        <w:t xml:space="preserve">, </w:t>
-      </w:r>
-      <w:proofErr w:type="gramStart"/>
-      <w:r>
-        <w:rPr>
-          <w:rFonts w:ascii="Times New Roman" w:hAnsi="Times New Roman" w:cs="Times New Roman"/>
-          <w:sz w:val="24"/>
-          <w:szCs w:val="24"/>
-        </w:rPr>
-        <w:t>o mesmo</w:t>
-      </w:r>
-      <w:proofErr w:type="gramEnd"/>
-      <w:r>
-        <w:rPr>
-          <w:rFonts w:ascii="Times New Roman" w:hAnsi="Times New Roman" w:cs="Times New Roman"/>
-          <w:sz w:val="24"/>
-          <w:szCs w:val="24"/>
-        </w:rPr>
-        <w:t xml:space="preserve"> não está acima e nem é coincidente com a parte superior do horizonte B </w:t>
-      </w:r>
-      <w:proofErr w:type="spellStart"/>
-      <w:r>
-        <w:rPr>
-          <w:rFonts w:ascii="Times New Roman" w:hAnsi="Times New Roman" w:cs="Times New Roman"/>
-          <w:sz w:val="24"/>
-          <w:szCs w:val="24"/>
-        </w:rPr>
-        <w:t>textural</w:t>
-      </w:r>
-      <w:proofErr w:type="spellEnd"/>
-      <w:r>
-        <w:rPr>
-          <w:rFonts w:ascii="Times New Roman" w:hAnsi="Times New Roman" w:cs="Times New Roman"/>
-          <w:sz w:val="24"/>
-          <w:szCs w:val="24"/>
-        </w:rPr>
-        <w:t xml:space="preserve">. Mesma regra vale se o horizonte </w:t>
-      </w:r>
-      <w:proofErr w:type="spellStart"/>
-      <w:r>
-        <w:rPr>
-          <w:rFonts w:ascii="Times New Roman" w:hAnsi="Times New Roman" w:cs="Times New Roman"/>
-          <w:sz w:val="24"/>
-          <w:szCs w:val="24"/>
-        </w:rPr>
-        <w:t>glei</w:t>
-      </w:r>
-      <w:proofErr w:type="spellEnd"/>
-      <w:r>
-        <w:rPr>
-          <w:rFonts w:ascii="Times New Roman" w:hAnsi="Times New Roman" w:cs="Times New Roman"/>
-          <w:sz w:val="24"/>
-          <w:szCs w:val="24"/>
-        </w:rPr>
-        <w:t xml:space="preserve"> estiver presente.</w:t>
+        <w:t>Solos que apresentam horizonte B textural com argila de atividade baixa imediatamente abaixo do horizonte A ou E. Se apresentar horizonte plíntico, o mesmo não está acima e nem é coincidente com a parte superior do horizonte B textural. Mesma regra vale se o horizonte glei estiver presente.</w:t>
       </w:r>
     </w:p>
     <w:p>
@@ -195,41 +92,22 @@
           <w:szCs w:val="24"/>
         </w:rPr>
       </w:pPr>
-      <w:proofErr w:type="spellStart"/>
-      <w:r>
-        <w:rPr>
-          <w:rFonts w:ascii="Times New Roman" w:hAnsi="Times New Roman" w:cs="Times New Roman"/>
-          <w:sz w:val="24"/>
-          <w:szCs w:val="24"/>
-        </w:rPr>
-        <w:t>Argissolos</w:t>
-      </w:r>
-      <w:proofErr w:type="spellEnd"/>
-      <w:r>
-        <w:rPr>
-          <w:rFonts w:ascii="Times New Roman" w:hAnsi="Times New Roman" w:cs="Times New Roman"/>
-          <w:sz w:val="24"/>
-          <w:szCs w:val="24"/>
-        </w:rPr>
-        <w:t xml:space="preserve"> Bruno-Acinzentados - PBAC Quando apresentarem cores pouco escurecidas em relação aos </w:t>
-      </w:r>
-      <w:proofErr w:type="spellStart"/>
-      <w:r>
-        <w:rPr>
-          <w:rFonts w:ascii="Times New Roman" w:hAnsi="Times New Roman" w:cs="Times New Roman"/>
-          <w:sz w:val="24"/>
-          <w:szCs w:val="24"/>
-        </w:rPr>
-        <w:t>subhorizontes</w:t>
-      </w:r>
-      <w:proofErr w:type="spellEnd"/>
-      <w:r>
-        <w:rPr>
-          <w:rFonts w:ascii="Times New Roman" w:hAnsi="Times New Roman" w:cs="Times New Roman"/>
-          <w:sz w:val="24"/>
-          <w:szCs w:val="24"/>
-        </w:rPr>
-        <w:t xml:space="preserve"> inferiores com matiz 5YR ou mais amarelo, valor 3 ou 4 e croma menor ou igual a 4, espessura de 60 a 100 cm na parte superior do horizonte B (inclusive BA). </w:t>
+      <w:r>
+        <w:rPr>
+          <w:rFonts w:ascii="Times New Roman" w:hAnsi="Times New Roman" w:cs="Times New Roman"/>
+          <w:color w:val="FF0000"/>
+          <w:sz w:val="24"/>
+          <w:szCs w:val="24"/>
+        </w:rPr>
+        <w:t xml:space="preserve">Argissolos Bruno-Acinzentados - PBAC </w:t>
+      </w:r>
+      <w:r>
+        <w:rPr>
+          <w:rFonts w:ascii="Times New Roman" w:hAnsi="Times New Roman" w:cs="Times New Roman"/>
+          <w:sz w:val="24"/>
+          <w:szCs w:val="24"/>
+        </w:rPr>
+        <w:t xml:space="preserve">Quando apresentarem cores pouco escurecidas em relação aos subhorizontes inferiores com matiz 5YR ou mais amarelo, valor 3 ou 4 e croma menor ou igual a 4, espessura de 60 a 100 cm na parte superior do horizonte B (inclusive BA). </w:t>
       </w:r>
     </w:p>
     <w:p>
@@ -243,23 +121,22 @@
           <w:szCs w:val="24"/>
         </w:rPr>
       </w:pPr>
-      <w:proofErr w:type="spellStart"/>
-      <w:r>
-        <w:rPr>
-          <w:rFonts w:ascii="Times New Roman" w:hAnsi="Times New Roman" w:cs="Times New Roman"/>
-          <w:sz w:val="24"/>
-          <w:szCs w:val="24"/>
-        </w:rPr>
-        <w:t>Argissolos</w:t>
-      </w:r>
-      <w:proofErr w:type="spellEnd"/>
-      <w:r>
-        <w:rPr>
-          <w:rFonts w:ascii="Times New Roman" w:hAnsi="Times New Roman" w:cs="Times New Roman"/>
-          <w:sz w:val="24"/>
-          <w:szCs w:val="24"/>
-        </w:rPr>
-        <w:t xml:space="preserve"> Acinzentados - PAC Quando apresentarem cores acinzentadas com matiz 7,5YR ou mais amarelo, valor 5 ou maior e croma &lt; 4 na maior parte dos primeiros 100 cm do horizonte B (inclusive BA).</w:t>
+      <w:r>
+        <w:rPr>
+          <w:rFonts w:ascii="Times New Roman" w:hAnsi="Times New Roman" w:cs="Times New Roman"/>
+          <w:color w:val="FF0000"/>
+          <w:sz w:val="24"/>
+          <w:szCs w:val="24"/>
+        </w:rPr>
+        <w:t xml:space="preserve">Argissolos Acinzentados - PAC </w:t>
+      </w:r>
+      <w:r>
+        <w:rPr>
+          <w:rFonts w:ascii="Times New Roman" w:hAnsi="Times New Roman" w:cs="Times New Roman"/>
+          <w:sz w:val="24"/>
+          <w:szCs w:val="24"/>
+        </w:rPr>
+        <w:t>Quando apresentarem cores acinzentadas com matiz 7,5YR ou mais amarelo, valor 5 ou maior e croma &lt; 4 na maior parte dos primeiros 100 cm do horizonte B (inclusive BA).</w:t>
       </w:r>
     </w:p>
     <w:p>
@@ -283,7 +160,6 @@
         </w:rPr>
         <w:t xml:space="preserve"> </w:t>
       </w:r>
-      <w:proofErr w:type="spellStart"/>
       <w:r>
         <w:rPr>
           <w:rFonts w:ascii="Times New Roman" w:hAnsi="Times New Roman" w:cs="Times New Roman"/>
@@ -293,19 +169,7 @@
           <w:sz w:val="24"/>
           <w:szCs w:val="24"/>
         </w:rPr>
-        <w:t>Argissolos</w:t>
-      </w:r>
-      <w:proofErr w:type="spellEnd"/>
-      <w:r>
-        <w:rPr>
-          <w:rFonts w:ascii="Times New Roman" w:hAnsi="Times New Roman" w:cs="Times New Roman"/>
-          <w:b/>
-          <w:bCs/>
-          <w:color w:val="FF0000"/>
-          <w:sz w:val="24"/>
-          <w:szCs w:val="24"/>
-        </w:rPr>
-        <w:t xml:space="preserve"> Amarelos- PA</w:t>
+        <w:t>Argissolos Amarelos- PA</w:t>
       </w:r>
       <w:r>
         <w:rPr>
@@ -322,25 +186,7 @@
           <w:sz w:val="24"/>
           <w:szCs w:val="24"/>
         </w:rPr>
-        <w:t xml:space="preserve">Solos com matiz mais amarelo que 7,5YR na maior parte dos primeiros 100 cm do </w:t>
-      </w:r>
-      <w:proofErr w:type="spellStart"/>
-      <w:r>
-        <w:rPr>
-          <w:rFonts w:ascii="Times New Roman" w:hAnsi="Times New Roman" w:cs="Times New Roman"/>
-          <w:sz w:val="24"/>
-          <w:szCs w:val="24"/>
-        </w:rPr>
-        <w:t>hz</w:t>
-      </w:r>
-      <w:proofErr w:type="spellEnd"/>
-      <w:r>
-        <w:rPr>
-          <w:rFonts w:ascii="Times New Roman" w:hAnsi="Times New Roman" w:cs="Times New Roman"/>
-          <w:sz w:val="24"/>
-          <w:szCs w:val="24"/>
-        </w:rPr>
-        <w:t xml:space="preserve"> B (Inclusive BA). </w:t>
+        <w:t xml:space="preserve">Solos com matiz mais amarelo que 7,5YR na maior parte dos primeiros 100 cm do hz B (Inclusive BA). </w:t>
       </w:r>
     </w:p>
     <w:p>
@@ -354,23 +200,22 @@
           <w:szCs w:val="24"/>
         </w:rPr>
       </w:pPr>
-      <w:proofErr w:type="spellStart"/>
-      <w:r>
-        <w:rPr>
-          <w:rFonts w:ascii="Times New Roman" w:hAnsi="Times New Roman" w:cs="Times New Roman"/>
-          <w:sz w:val="24"/>
-          <w:szCs w:val="24"/>
-        </w:rPr>
-        <w:t>Argissolos</w:t>
-      </w:r>
-      <w:proofErr w:type="spellEnd"/>
-      <w:r>
-        <w:rPr>
-          <w:rFonts w:ascii="Times New Roman" w:hAnsi="Times New Roman" w:cs="Times New Roman"/>
-          <w:sz w:val="24"/>
-          <w:szCs w:val="24"/>
-        </w:rPr>
-        <w:t xml:space="preserve"> Vermelhos - PV Quando apresentarem matiz 2,5 YR ou mais vermelho, ou 5YR com valor e croma iguais ou menores que 4 na maior parte dos primeiros 100 cm do horizonte B (exclusive BC). </w:t>
+      <w:r>
+        <w:rPr>
+          <w:rFonts w:ascii="Times New Roman" w:hAnsi="Times New Roman" w:cs="Times New Roman"/>
+          <w:color w:val="FF0000"/>
+          <w:sz w:val="24"/>
+          <w:szCs w:val="24"/>
+        </w:rPr>
+        <w:t xml:space="preserve">Argissolos Vermelhos - PV </w:t>
+      </w:r>
+      <w:r>
+        <w:rPr>
+          <w:rFonts w:ascii="Times New Roman" w:hAnsi="Times New Roman" w:cs="Times New Roman"/>
+          <w:sz w:val="24"/>
+          <w:szCs w:val="24"/>
+        </w:rPr>
+        <w:t xml:space="preserve">Quando apresentarem matiz 2,5 YR ou mais vermelho, ou 5YR com valor e croma iguais ou menores que 4 na maior parte dos primeiros 100 cm do horizonte B (exclusive BC). </w:t>
       </w:r>
     </w:p>
     <w:p>
@@ -384,67 +229,30 @@
           <w:szCs w:val="24"/>
         </w:rPr>
       </w:pPr>
-      <w:proofErr w:type="spellStart"/>
-      <w:r>
-        <w:rPr>
-          <w:rFonts w:ascii="Times New Roman" w:hAnsi="Times New Roman" w:cs="Times New Roman"/>
-          <w:sz w:val="24"/>
-          <w:szCs w:val="24"/>
-        </w:rPr>
-        <w:t>Argissolos</w:t>
-      </w:r>
-      <w:proofErr w:type="spellEnd"/>
-      <w:r>
-        <w:rPr>
-          <w:rFonts w:ascii="Times New Roman" w:hAnsi="Times New Roman" w:cs="Times New Roman"/>
-          <w:sz w:val="24"/>
-          <w:szCs w:val="24"/>
-        </w:rPr>
-        <w:t xml:space="preserve"> Vermelho-Amarelos - PVA Outros solos de cores vermelho-amareladas ou </w:t>
-      </w:r>
-      <w:proofErr w:type="spellStart"/>
-      <w:r>
-        <w:rPr>
-          <w:rFonts w:ascii="Times New Roman" w:hAnsi="Times New Roman" w:cs="Times New Roman"/>
-          <w:sz w:val="24"/>
-          <w:szCs w:val="24"/>
-        </w:rPr>
-        <w:t>amarelo-avermelhadas</w:t>
-      </w:r>
-      <w:proofErr w:type="spellEnd"/>
-      <w:r>
-        <w:rPr>
-          <w:rFonts w:ascii="Times New Roman" w:hAnsi="Times New Roman" w:cs="Times New Roman"/>
-          <w:sz w:val="24"/>
-          <w:szCs w:val="24"/>
-        </w:rPr>
-        <w:t xml:space="preserve"> que não se enquadram nas classes anteriores.</w:t>
-      </w:r>
-      <w:r>
-        <w:rPr>
-          <w:rFonts w:ascii="Times New Roman" w:hAnsi="Times New Roman" w:cs="Times New Roman"/>
-          <w:sz w:val="24"/>
-          <w:szCs w:val="24"/>
-        </w:rPr>
-        <w:t xml:space="preserve"> </w:t>
-      </w:r>
-      <w:proofErr w:type="spellStart"/>
-      <w:r>
-        <w:rPr>
-          <w:rFonts w:ascii="Times New Roman" w:hAnsi="Times New Roman" w:cs="Times New Roman"/>
-          <w:sz w:val="24"/>
-          <w:szCs w:val="24"/>
-        </w:rPr>
-        <w:t>Argissolos</w:t>
-      </w:r>
-      <w:proofErr w:type="spellEnd"/>
-      <w:r>
-        <w:rPr>
-          <w:rFonts w:ascii="Times New Roman" w:hAnsi="Times New Roman" w:cs="Times New Roman"/>
-          <w:sz w:val="24"/>
-          <w:szCs w:val="24"/>
-        </w:rPr>
-        <w:t xml:space="preserve"> – PVA </w:t>
+      <w:r>
+        <w:rPr>
+          <w:rFonts w:ascii="Times New Roman" w:hAnsi="Times New Roman" w:cs="Times New Roman"/>
+          <w:color w:val="FF0000"/>
+          <w:sz w:val="24"/>
+          <w:szCs w:val="24"/>
+        </w:rPr>
+        <w:t xml:space="preserve">Argissolos Vermelho-Amarelos - PVA </w:t>
+      </w:r>
+      <w:r>
+        <w:rPr>
+          <w:rFonts w:ascii="Times New Roman" w:hAnsi="Times New Roman" w:cs="Times New Roman"/>
+          <w:sz w:val="24"/>
+          <w:szCs w:val="24"/>
+        </w:rPr>
+        <w:t>Outros solos de cores vermelho-amareladas ou amarelo-avermelhadas que não se enquadram nas classes anteriores.</w:t>
+      </w:r>
+      <w:r>
+        <w:rPr>
+          <w:rFonts w:ascii="Times New Roman" w:hAnsi="Times New Roman" w:cs="Times New Roman"/>
+          <w:sz w:val="24"/>
+          <w:szCs w:val="24"/>
+        </w:rPr>
+        <w:t xml:space="preserve"> Argissolos – PVA </w:t>
       </w:r>
       <w:r>
         <w:rPr>
@@ -462,25 +270,7 @@
           <w:sz w:val="24"/>
           <w:szCs w:val="24"/>
         </w:rPr>
-        <w:t xml:space="preserve">de cores vermelho-amareladas ou </w:t>
-      </w:r>
-      <w:proofErr w:type="spellStart"/>
-      <w:r>
-        <w:rPr>
-          <w:rFonts w:ascii="Times New Roman" w:hAnsi="Times New Roman" w:cs="Times New Roman"/>
-          <w:sz w:val="24"/>
-          <w:szCs w:val="24"/>
-        </w:rPr>
-        <w:t>amarelo-avermelhadas</w:t>
-      </w:r>
-      <w:proofErr w:type="spellEnd"/>
-      <w:r>
-        <w:rPr>
-          <w:rFonts w:ascii="Times New Roman" w:hAnsi="Times New Roman" w:cs="Times New Roman"/>
-          <w:sz w:val="24"/>
-          <w:szCs w:val="24"/>
-        </w:rPr>
-        <w:t xml:space="preserve">, </w:t>
+        <w:t xml:space="preserve">de cores vermelho-amareladas ou amarelo-avermelhadas, </w:t>
       </w:r>
       <w:r>
         <w:rPr>
@@ -490,40 +280,7 @@
           <w:szCs w:val="24"/>
           <w:shd w:val="clear" w:color="auto" w:fill="FFFFFF"/>
         </w:rPr>
-        <w:t xml:space="preserve">profundos a profundos, moderadamente drenados, com horizonte B </w:t>
-      </w:r>
-      <w:proofErr w:type="spellStart"/>
-      <w:r>
-        <w:rPr>
-          <w:rFonts w:ascii="Times New Roman" w:hAnsi="Times New Roman" w:cs="Times New Roman"/>
-          <w:color w:val="202124"/>
-          <w:sz w:val="24"/>
-          <w:szCs w:val="24"/>
-          <w:shd w:val="clear" w:color="auto" w:fill="FFFFFF"/>
-        </w:rPr>
-        <w:t>textural</w:t>
-      </w:r>
-      <w:proofErr w:type="spellEnd"/>
-      <w:r>
-        <w:rPr>
-          <w:rFonts w:ascii="Times New Roman" w:hAnsi="Times New Roman" w:cs="Times New Roman"/>
-          <w:color w:val="202124"/>
-          <w:sz w:val="24"/>
-          <w:szCs w:val="24"/>
-          <w:shd w:val="clear" w:color="auto" w:fill="FFFFFF"/>
-        </w:rPr>
-        <w:t xml:space="preserve"> (horizonte diagnostico que caracteriza a classe de solo), de cores vermelhas a amarelas e textura argilosa, abaixo de um horizonte A ou E de cores mais claras e textura arenosa ou média, com baixos teores de matéria orgânica</w:t>
-      </w:r>
-      <w:proofErr w:type="gramStart"/>
-      <w:r>
-        <w:rPr>
-          <w:rFonts w:ascii="Times New Roman" w:hAnsi="Times New Roman" w:cs="Times New Roman"/>
-          <w:color w:val="202124"/>
-          <w:sz w:val="24"/>
-          <w:szCs w:val="24"/>
-          <w:shd w:val="clear" w:color="auto" w:fill="FFFFFF"/>
-        </w:rPr>
-        <w:t xml:space="preserve">. </w:t>
+        <w:t xml:space="preserve">profundos a profundos, moderadamente drenados, com horizonte B textural (horizonte diagnostico que caracteriza a classe de solo), de cores vermelhas a amarelas e textura argilosa, abaixo de um horizonte A ou E de cores mais claras e textura arenosa ou média, com baixos teores de matéria orgânica. </w:t>
       </w:r>
       <w:r>
         <w:rPr>
@@ -533,7 +290,6 @@
         </w:rPr>
         <w:t>.</w:t>
       </w:r>
-      <w:proofErr w:type="gramEnd"/>
     </w:p>
     <w:p>
       <w:pPr>
@@ -580,9 +336,8 @@
           <w:szCs w:val="24"/>
           <w:shd w:val="clear" w:color="auto" w:fill="FFFFFF"/>
         </w:rPr>
-        <w:t xml:space="preserve">são solos constituídos por material mineral com horizonte </w:t>
-      </w:r>
-      <w:proofErr w:type="spellStart"/>
+        <w:t xml:space="preserve">são solos constituídos por material mineral com horizonte glei iniciando-se dentro dos primeiros 50 cm a partir da superfície do solo, ou a profundidade maior que 50 cm e menor ou igual a 150 cm desde que imediatamente abaixo de horizonte A ou E ou de horizonte hístico com espessura insuficiente para definir a classe dos Organossolos. Não apresentam horizonte vértico em posição diagnóstica para Vertissolos ou textura exclusivamente areia ou areia franca em todos os horizontes até a profundidade de 150 cm a partir da superfície do solo ou até um contato lítico ou lítico fragmentário. Horizonte plânico, horizonte plíntico, horizonte </w:t>
+      </w:r>
       <w:r>
         <w:rPr>
           <w:rFonts w:ascii="Times New Roman" w:hAnsi="Times New Roman" w:cs="Times New Roman"/>
@@ -591,195 +346,8 @@
           <w:szCs w:val="24"/>
           <w:shd w:val="clear" w:color="auto" w:fill="FFFFFF"/>
         </w:rPr>
-        <w:t>glei</w:t>
-      </w:r>
-      <w:proofErr w:type="spellEnd"/>
-      <w:r>
-        <w:rPr>
-          <w:rFonts w:ascii="Times New Roman" w:hAnsi="Times New Roman" w:cs="Times New Roman"/>
-          <w:color w:val="000000" w:themeColor="text1"/>
-          <w:sz w:val="24"/>
-          <w:szCs w:val="24"/>
-          <w:shd w:val="clear" w:color="auto" w:fill="FFFFFF"/>
-        </w:rPr>
-        <w:t xml:space="preserve"> iniciando-se dentro dos primeiros 50 cm a partir da superfície do solo, ou a profundidade maior que 50 cm e menor ou igual a 150 cm desde que imediatamente abaixo de horizonte A ou E ou de horizonte </w:t>
-      </w:r>
-      <w:proofErr w:type="spellStart"/>
-      <w:r>
-        <w:rPr>
-          <w:rFonts w:ascii="Times New Roman" w:hAnsi="Times New Roman" w:cs="Times New Roman"/>
-          <w:color w:val="000000" w:themeColor="text1"/>
-          <w:sz w:val="24"/>
-          <w:szCs w:val="24"/>
-          <w:shd w:val="clear" w:color="auto" w:fill="FFFFFF"/>
-        </w:rPr>
-        <w:t>hístico</w:t>
-      </w:r>
-      <w:proofErr w:type="spellEnd"/>
-      <w:r>
-        <w:rPr>
-          <w:rFonts w:ascii="Times New Roman" w:hAnsi="Times New Roman" w:cs="Times New Roman"/>
-          <w:color w:val="000000" w:themeColor="text1"/>
-          <w:sz w:val="24"/>
-          <w:szCs w:val="24"/>
-          <w:shd w:val="clear" w:color="auto" w:fill="FFFFFF"/>
-        </w:rPr>
-        <w:t xml:space="preserve"> com espessura insuficiente para definir a classe dos </w:t>
-      </w:r>
-      <w:proofErr w:type="spellStart"/>
-      <w:r>
-        <w:rPr>
-          <w:rFonts w:ascii="Times New Roman" w:hAnsi="Times New Roman" w:cs="Times New Roman"/>
-          <w:color w:val="000000" w:themeColor="text1"/>
-          <w:sz w:val="24"/>
-          <w:szCs w:val="24"/>
-          <w:shd w:val="clear" w:color="auto" w:fill="FFFFFF"/>
-        </w:rPr>
-        <w:t>Organossolos</w:t>
-      </w:r>
-      <w:proofErr w:type="spellEnd"/>
-      <w:r>
-        <w:rPr>
-          <w:rFonts w:ascii="Times New Roman" w:hAnsi="Times New Roman" w:cs="Times New Roman"/>
-          <w:color w:val="000000" w:themeColor="text1"/>
-          <w:sz w:val="24"/>
-          <w:szCs w:val="24"/>
-          <w:shd w:val="clear" w:color="auto" w:fill="FFFFFF"/>
-        </w:rPr>
-        <w:t xml:space="preserve">. Não apresentam horizonte </w:t>
-      </w:r>
-      <w:proofErr w:type="spellStart"/>
-      <w:r>
-        <w:rPr>
-          <w:rFonts w:ascii="Times New Roman" w:hAnsi="Times New Roman" w:cs="Times New Roman"/>
-          <w:color w:val="000000" w:themeColor="text1"/>
-          <w:sz w:val="24"/>
-          <w:szCs w:val="24"/>
-          <w:shd w:val="clear" w:color="auto" w:fill="FFFFFF"/>
-        </w:rPr>
-        <w:t>vértico</w:t>
-      </w:r>
-      <w:proofErr w:type="spellEnd"/>
-      <w:r>
-        <w:rPr>
-          <w:rFonts w:ascii="Times New Roman" w:hAnsi="Times New Roman" w:cs="Times New Roman"/>
-          <w:color w:val="000000" w:themeColor="text1"/>
-          <w:sz w:val="24"/>
-          <w:szCs w:val="24"/>
-          <w:shd w:val="clear" w:color="auto" w:fill="FFFFFF"/>
-        </w:rPr>
-        <w:t xml:space="preserve"> em posição diagnóstica para </w:t>
-      </w:r>
-      <w:proofErr w:type="spellStart"/>
-      <w:r>
-        <w:rPr>
-          <w:rFonts w:ascii="Times New Roman" w:hAnsi="Times New Roman" w:cs="Times New Roman"/>
-          <w:color w:val="000000" w:themeColor="text1"/>
-          <w:sz w:val="24"/>
-          <w:szCs w:val="24"/>
-          <w:shd w:val="clear" w:color="auto" w:fill="FFFFFF"/>
-        </w:rPr>
-        <w:t>Vertissolos</w:t>
-      </w:r>
-      <w:proofErr w:type="spellEnd"/>
-      <w:r>
-        <w:rPr>
-          <w:rFonts w:ascii="Times New Roman" w:hAnsi="Times New Roman" w:cs="Times New Roman"/>
-          <w:color w:val="000000" w:themeColor="text1"/>
-          <w:sz w:val="24"/>
-          <w:szCs w:val="24"/>
-          <w:shd w:val="clear" w:color="auto" w:fill="FFFFFF"/>
-        </w:rPr>
-        <w:t xml:space="preserve"> ou textura exclusivamente areia ou areia franca em todos os horizontes até a profundidade de 150 cm a partir da superfície do solo ou até um contato lítico ou lítico fragmentário. Horizonte </w:t>
-      </w:r>
-      <w:proofErr w:type="spellStart"/>
-      <w:r>
-        <w:rPr>
-          <w:rFonts w:ascii="Times New Roman" w:hAnsi="Times New Roman" w:cs="Times New Roman"/>
-          <w:color w:val="000000" w:themeColor="text1"/>
-          <w:sz w:val="24"/>
-          <w:szCs w:val="24"/>
-          <w:shd w:val="clear" w:color="auto" w:fill="FFFFFF"/>
-        </w:rPr>
-        <w:t>plânico</w:t>
-      </w:r>
-      <w:proofErr w:type="spellEnd"/>
-      <w:r>
-        <w:rPr>
-          <w:rFonts w:ascii="Times New Roman" w:hAnsi="Times New Roman" w:cs="Times New Roman"/>
-          <w:color w:val="000000" w:themeColor="text1"/>
-          <w:sz w:val="24"/>
-          <w:szCs w:val="24"/>
-          <w:shd w:val="clear" w:color="auto" w:fill="FFFFFF"/>
-        </w:rPr>
-        <w:t xml:space="preserve">, horizonte </w:t>
-      </w:r>
-      <w:proofErr w:type="spellStart"/>
-      <w:r>
-        <w:rPr>
-          <w:rFonts w:ascii="Times New Roman" w:hAnsi="Times New Roman" w:cs="Times New Roman"/>
-          <w:color w:val="000000" w:themeColor="text1"/>
-          <w:sz w:val="24"/>
-          <w:szCs w:val="24"/>
-          <w:shd w:val="clear" w:color="auto" w:fill="FFFFFF"/>
-        </w:rPr>
-        <w:t>plíntico</w:t>
-      </w:r>
-      <w:proofErr w:type="spellEnd"/>
-      <w:r>
-        <w:rPr>
-          <w:rFonts w:ascii="Times New Roman" w:hAnsi="Times New Roman" w:cs="Times New Roman"/>
-          <w:color w:val="000000" w:themeColor="text1"/>
-          <w:sz w:val="24"/>
-          <w:szCs w:val="24"/>
-          <w:shd w:val="clear" w:color="auto" w:fill="FFFFFF"/>
-        </w:rPr>
-        <w:t xml:space="preserve">, horizonte </w:t>
-      </w:r>
-      <w:proofErr w:type="spellStart"/>
-      <w:r>
-        <w:rPr>
-          <w:rFonts w:ascii="Times New Roman" w:hAnsi="Times New Roman" w:cs="Times New Roman"/>
-          <w:color w:val="000000" w:themeColor="text1"/>
-          <w:sz w:val="24"/>
-          <w:szCs w:val="24"/>
-          <w:shd w:val="clear" w:color="auto" w:fill="FFFFFF"/>
-        </w:rPr>
         <w:lastRenderedPageBreak/>
-        <w:t>concrecionário</w:t>
-      </w:r>
-      <w:proofErr w:type="spellEnd"/>
-      <w:r>
-        <w:rPr>
-          <w:rFonts w:ascii="Times New Roman" w:hAnsi="Times New Roman" w:cs="Times New Roman"/>
-          <w:color w:val="000000" w:themeColor="text1"/>
-          <w:sz w:val="24"/>
-          <w:szCs w:val="24"/>
-          <w:shd w:val="clear" w:color="auto" w:fill="FFFFFF"/>
-        </w:rPr>
-        <w:t xml:space="preserve"> ou horizonte </w:t>
-      </w:r>
-      <w:proofErr w:type="spellStart"/>
-      <w:r>
-        <w:rPr>
-          <w:rFonts w:ascii="Times New Roman" w:hAnsi="Times New Roman" w:cs="Times New Roman"/>
-          <w:color w:val="000000" w:themeColor="text1"/>
-          <w:sz w:val="24"/>
-          <w:szCs w:val="24"/>
-          <w:shd w:val="clear" w:color="auto" w:fill="FFFFFF"/>
-        </w:rPr>
-        <w:t>litoplíntico</w:t>
-      </w:r>
-      <w:proofErr w:type="spellEnd"/>
-      <w:r>
-        <w:rPr>
-          <w:rFonts w:ascii="Times New Roman" w:hAnsi="Times New Roman" w:cs="Times New Roman"/>
-          <w:color w:val="000000" w:themeColor="text1"/>
-          <w:sz w:val="24"/>
-          <w:szCs w:val="24"/>
-          <w:shd w:val="clear" w:color="auto" w:fill="FFFFFF"/>
-        </w:rPr>
-        <w:t>, se presentes, devem estar à profundidade maior que 200 cm a partir da superfície do solo.</w:t>
+        <w:t>concrecionário ou horizonte litoplíntico, se presentes, devem estar à profundidade maior que 200 cm a partir da superfície do solo.</w:t>
       </w:r>
     </w:p>
     <w:p>
@@ -825,35 +393,17 @@
         </w:rPr>
         <w:t xml:space="preserve"> </w:t>
       </w:r>
-      <w:bookmarkStart w:id="1" w:name="_Hlk136437666"/>
-      <w:r>
-        <w:rPr>
-          <w:rFonts w:ascii="Times New Roman" w:hAnsi="Times New Roman" w:cs="Times New Roman"/>
-          <w:sz w:val="24"/>
-          <w:szCs w:val="24"/>
-        </w:rPr>
-        <w:t xml:space="preserve">são solos constituídos por material mineral, apresentando horizonte B </w:t>
-      </w:r>
-      <w:proofErr w:type="spellStart"/>
-      <w:r>
-        <w:rPr>
-          <w:rFonts w:ascii="Times New Roman" w:hAnsi="Times New Roman" w:cs="Times New Roman"/>
-          <w:sz w:val="24"/>
-          <w:szCs w:val="24"/>
-        </w:rPr>
-        <w:t>latossólico</w:t>
-      </w:r>
-      <w:proofErr w:type="spellEnd"/>
-      <w:r>
-        <w:rPr>
-          <w:rFonts w:ascii="Times New Roman" w:hAnsi="Times New Roman" w:cs="Times New Roman"/>
-          <w:sz w:val="24"/>
-          <w:szCs w:val="24"/>
-        </w:rPr>
-        <w:t xml:space="preserve"> precedido de qualquer tipo de horizonte A dentro de 200 cm a partir da superfície do solo ou dentro de 300 cm se o horizonte A apresenta mais que 150 cm de espessura.</w:t>
-      </w:r>
-    </w:p>
-    <w:bookmarkEnd w:id="1"/>
+      <w:bookmarkStart w:id="2" w:name="_Hlk136437666"/>
+      <w:r>
+        <w:rPr>
+          <w:rFonts w:ascii="Times New Roman" w:hAnsi="Times New Roman" w:cs="Times New Roman"/>
+          <w:sz w:val="24"/>
+          <w:szCs w:val="24"/>
+        </w:rPr>
+        <w:t>são solos constituídos por material mineral, apresentando horizonte B latossólico precedido de qualquer tipo de horizonte A dentro de 200 cm a partir da superfície do solo ou dentro de 300 cm se o horizonte A apresenta mais que 150 cm de espessura.</w:t>
+      </w:r>
+    </w:p>
+    <w:bookmarkEnd w:id="2"/>
     <w:p>
       <w:pPr>
         <w:spacing w:line="360" w:lineRule="auto"/>
@@ -898,43 +448,7 @@
           <w:sz w:val="24"/>
           <w:szCs w:val="24"/>
         </w:rPr>
-        <w:t xml:space="preserve">são identificados em extensas áreas dispersas em todo o território nacional associados aos relevos, plano, suave ondulado ou ondulado. Ocorrem em ambientes bem drenados, sendo muito profundos e uniformes em características de cor, textura e estrutura em profundidade. São muito utilizados para agropecuária apresentando limitações de ordem química em profundidade ao desenvolvimento do sistema radicular se forem </w:t>
-      </w:r>
-      <w:proofErr w:type="spellStart"/>
-      <w:r>
-        <w:rPr>
-          <w:rFonts w:ascii="Times New Roman" w:hAnsi="Times New Roman" w:cs="Times New Roman"/>
-          <w:sz w:val="24"/>
-          <w:szCs w:val="24"/>
-        </w:rPr>
-        <w:t>álicos</w:t>
-      </w:r>
-      <w:proofErr w:type="spellEnd"/>
-      <w:r>
-        <w:rPr>
-          <w:rFonts w:ascii="Times New Roman" w:hAnsi="Times New Roman" w:cs="Times New Roman"/>
-          <w:sz w:val="24"/>
-          <w:szCs w:val="24"/>
-        </w:rPr>
-        <w:t xml:space="preserve">, distróficos ou </w:t>
-      </w:r>
-      <w:proofErr w:type="spellStart"/>
-      <w:r>
-        <w:rPr>
-          <w:rFonts w:ascii="Times New Roman" w:hAnsi="Times New Roman" w:cs="Times New Roman"/>
-          <w:sz w:val="24"/>
-          <w:szCs w:val="24"/>
-        </w:rPr>
-        <w:t>ácricos</w:t>
-      </w:r>
-      <w:proofErr w:type="spellEnd"/>
-      <w:r>
-        <w:rPr>
-          <w:rFonts w:ascii="Times New Roman" w:hAnsi="Times New Roman" w:cs="Times New Roman"/>
-          <w:sz w:val="24"/>
-          <w:szCs w:val="24"/>
-        </w:rPr>
-        <w:t>. Em condições naturais, os teores de fósforo são baixos, sendo indicada a adubação fosfatada. Outra limitação ao uso desta classe de solo é a baixa quantidade de água disponível às plantas.</w:t>
+        <w:t>são identificados em extensas áreas dispersas em todo o território nacional associados aos relevos, plano, suave ondulado ou ondulado. Ocorrem em ambientes bem drenados, sendo muito profundos e uniformes em características de cor, textura e estrutura em profundidade. São muito utilizados para agropecuária apresentando limitações de ordem química em profundidade ao desenvolvimento do sistema radicular se forem álicos, distróficos ou ácricos. Em condições naturais, os teores de fósforo são baixos, sendo indicada a adubação fosfatada. Outra limitação ao uso desta classe de solo é a baixa quantidade de água disponível às plantas.</w:t>
       </w:r>
     </w:p>
     <w:p>
@@ -948,7 +462,7 @@
           <w:szCs w:val="24"/>
         </w:rPr>
       </w:pPr>
-      <w:bookmarkStart w:id="2" w:name="_Hlk141084813"/>
+      <w:bookmarkStart w:id="3" w:name="_Hlk141084813"/>
       <w:r>
         <w:rPr>
           <w:rFonts w:ascii="Times New Roman" w:hAnsi="Times New Roman" w:cs="Times New Roman"/>
@@ -996,8 +510,8 @@
           <w:szCs w:val="24"/>
         </w:rPr>
       </w:pPr>
-      <w:bookmarkStart w:id="3" w:name="_Hlk153461668"/>
-      <w:bookmarkEnd w:id="2"/>
+      <w:bookmarkStart w:id="4" w:name="_Hlk153461668"/>
+      <w:bookmarkEnd w:id="3"/>
       <w:r>
         <w:rPr>
           <w:rFonts w:ascii="Times New Roman" w:hAnsi="Times New Roman" w:cs="Times New Roman"/>
@@ -1006,27 +520,25 @@
         </w:rPr>
         <w:t xml:space="preserve">Os </w:t>
       </w:r>
-      <w:proofErr w:type="spellStart"/>
-      <w:r>
-        <w:rPr>
-          <w:rFonts w:ascii="Times New Roman" w:hAnsi="Times New Roman" w:cs="Times New Roman"/>
-          <w:b/>
-          <w:color w:val="FF0000"/>
-          <w:sz w:val="24"/>
-          <w:szCs w:val="24"/>
-        </w:rPr>
-        <w:t>Neossolos</w:t>
-      </w:r>
-      <w:proofErr w:type="spellEnd"/>
-      <w:r>
-        <w:rPr>
-          <w:rFonts w:ascii="Times New Roman" w:hAnsi="Times New Roman" w:cs="Times New Roman"/>
-          <w:b/>
-          <w:color w:val="FF0000"/>
-          <w:sz w:val="24"/>
-          <w:szCs w:val="24"/>
-        </w:rPr>
-        <w:t xml:space="preserve"> são</w:t>
+      <w:r>
+        <w:rPr>
+          <w:rFonts w:ascii="Times New Roman" w:hAnsi="Times New Roman" w:cs="Times New Roman"/>
+          <w:b/>
+          <w:color w:val="FF0000"/>
+          <w:sz w:val="24"/>
+          <w:szCs w:val="24"/>
+        </w:rPr>
+        <w:t xml:space="preserve">Neossolos </w:t>
+      </w:r>
+      <w:r>
+        <w:rPr>
+          <w:rFonts w:ascii="Times New Roman" w:hAnsi="Times New Roman" w:cs="Times New Roman"/>
+          <w:b/>
+          <w:color w:val="000000" w:themeColor="text1"/>
+          <w:sz w:val="24"/>
+          <w:szCs w:val="24"/>
+        </w:rPr>
+        <w:t>são</w:t>
       </w:r>
       <w:r>
         <w:rPr>
@@ -1043,79 +555,7 @@
           <w:sz w:val="24"/>
           <w:szCs w:val="24"/>
         </w:rPr>
-        <w:t xml:space="preserve">solos constituídos por material mineral ou por material orgânico pouco espesso, com insuficiência de manifestação dos atributos diagnósticos que caracterizam os diversos processos de formação dos solos, seja em razão de maior resistência do material de origem ou dos demais fatores de formação (clima, relevo </w:t>
-      </w:r>
-      <w:proofErr w:type="gramStart"/>
-      <w:r>
-        <w:rPr>
-          <w:rFonts w:ascii="Times New Roman" w:hAnsi="Times New Roman" w:cs="Times New Roman"/>
-          <w:sz w:val="24"/>
-          <w:szCs w:val="24"/>
-        </w:rPr>
-        <w:t>ou  tempo</w:t>
-      </w:r>
-      <w:proofErr w:type="gramEnd"/>
-      <w:r>
-        <w:rPr>
-          <w:rFonts w:ascii="Times New Roman" w:hAnsi="Times New Roman" w:cs="Times New Roman"/>
-          <w:sz w:val="24"/>
-          <w:szCs w:val="24"/>
-        </w:rPr>
-        <w:t xml:space="preserve">) que podem impedir ou limitar a evolução dos solos. Apresentam predomínio de características herdadas do material originário, sendo definido pelo </w:t>
-      </w:r>
-      <w:proofErr w:type="spellStart"/>
-      <w:r>
-        <w:rPr>
-          <w:rFonts w:ascii="Times New Roman" w:hAnsi="Times New Roman" w:cs="Times New Roman"/>
-          <w:sz w:val="24"/>
-          <w:szCs w:val="24"/>
-        </w:rPr>
-        <w:t>SiBCS</w:t>
-      </w:r>
-      <w:proofErr w:type="spellEnd"/>
-      <w:r>
-        <w:rPr>
-          <w:rFonts w:ascii="Times New Roman" w:hAnsi="Times New Roman" w:cs="Times New Roman"/>
-          <w:sz w:val="24"/>
-          <w:szCs w:val="24"/>
-        </w:rPr>
-        <w:t xml:space="preserve"> (Embrapa, 2006) como solos pouco evoluídos e sem a presença de horizonte diagnóstico. Os </w:t>
-      </w:r>
-      <w:proofErr w:type="spellStart"/>
-      <w:r>
-        <w:rPr>
-          <w:rFonts w:ascii="Times New Roman" w:hAnsi="Times New Roman" w:cs="Times New Roman"/>
-          <w:sz w:val="24"/>
-          <w:szCs w:val="24"/>
-        </w:rPr>
-        <w:t>Neossolos</w:t>
-      </w:r>
-      <w:proofErr w:type="spellEnd"/>
-      <w:r>
-        <w:rPr>
-          <w:rFonts w:ascii="Times New Roman" w:hAnsi="Times New Roman" w:cs="Times New Roman"/>
-          <w:sz w:val="24"/>
-          <w:szCs w:val="24"/>
-        </w:rPr>
-        <w:t xml:space="preserve"> podem apresentar alta (</w:t>
-      </w:r>
-      <w:proofErr w:type="spellStart"/>
-      <w:r>
-        <w:rPr>
-          <w:rFonts w:ascii="Times New Roman" w:hAnsi="Times New Roman" w:cs="Times New Roman"/>
-          <w:sz w:val="24"/>
-          <w:szCs w:val="24"/>
-        </w:rPr>
-        <w:t>eutróficos</w:t>
-      </w:r>
-      <w:proofErr w:type="spellEnd"/>
-      <w:r>
-        <w:rPr>
-          <w:rFonts w:ascii="Times New Roman" w:hAnsi="Times New Roman" w:cs="Times New Roman"/>
-          <w:sz w:val="24"/>
-          <w:szCs w:val="24"/>
-        </w:rPr>
-        <w:t xml:space="preserve">) ou baixa (distróficos) saturação por bases, </w:t>
+        <w:t xml:space="preserve">solos constituídos por material mineral ou por material orgânico pouco espesso, com insuficiência de manifestação dos atributos diagnósticos que caracterizam os diversos processos de formação dos solos, seja em razão de maior resistência do material de origem ou dos demais fatores de formação (clima, relevo ou  tempo) que podem impedir ou limitar a evolução dos solos. Apresentam predomínio de características herdadas do material originário, sendo definido pelo SiBCS (Embrapa, 2006) como solos pouco evoluídos e sem a presença de horizonte diagnóstico. Os Neossolos podem apresentar alta (eutróficos) ou baixa (distróficos) saturação por bases, </w:t>
       </w:r>
       <w:r>
         <w:rPr>
@@ -1126,7 +566,7 @@
         <w:lastRenderedPageBreak/>
         <w:t>acidez e altos teores de alumínio e de sódio. Variam de solos rasos até profundos e de baixa a alta permeabilidade</w:t>
       </w:r>
-      <w:bookmarkEnd w:id="3"/>
+      <w:bookmarkEnd w:id="4"/>
       <w:r>
         <w:rPr>
           <w:rFonts w:ascii="Times New Roman" w:hAnsi="Times New Roman" w:cs="Times New Roman"/>
@@ -1146,50 +586,37 @@
           <w:color w:val="000000" w:themeColor="text1"/>
         </w:rPr>
       </w:pPr>
-      <w:proofErr w:type="spellStart"/>
-      <w:r>
-        <w:rPr>
-          <w:b/>
-          <w:color w:val="FF0000"/>
-        </w:rPr>
-        <w:t>Neossolos</w:t>
-      </w:r>
-      <w:proofErr w:type="spellEnd"/>
-      <w:r>
-        <w:rPr>
-          <w:b/>
+      <w:r>
+        <w:rPr>
+          <w:b/>
+          <w:color w:val="FF0000"/>
+        </w:rPr>
+        <w:t>Neossolos quartzarênicos</w:t>
+      </w:r>
+      <w:r>
+        <w:rPr>
+          <w:b/>
+          <w:color w:val="FF0000"/>
+        </w:rPr>
+        <w:t xml:space="preserve"> -</w:t>
+      </w:r>
+      <w:r>
+        <w:rPr>
           <w:color w:val="FF0000"/>
         </w:rPr>
         <w:t xml:space="preserve"> </w:t>
       </w:r>
-      <w:proofErr w:type="spellStart"/>
-      <w:proofErr w:type="gramStart"/>
-      <w:r>
-        <w:rPr>
-          <w:b/>
-          <w:color w:val="FF0000"/>
-        </w:rPr>
-        <w:t>quartzarênicos</w:t>
-      </w:r>
-      <w:proofErr w:type="spellEnd"/>
-      <w:r>
-        <w:rPr>
-          <w:color w:val="FF0000"/>
-        </w:rPr>
-        <w:t xml:space="preserve">  RQ</w:t>
-      </w:r>
-      <w:proofErr w:type="gramEnd"/>
-      <w:r>
-        <w:rPr>
-          <w:color w:val="FF0000"/>
-        </w:rPr>
-        <w:t xml:space="preserve"> </w:t>
+      <w:r>
+        <w:rPr>
+          <w:color w:val="FF0000"/>
+        </w:rPr>
+        <w:t>RQ</w:t>
       </w:r>
       <w:r>
         <w:rPr>
           <w:color w:val="000000" w:themeColor="text1"/>
         </w:rPr>
-        <w:t>- São solos profundos de textura arenosa, tendo nas frações areia grossa e areia fina 95% ou mais de quartzo, calcedônia e opala e, praticamente, ausência de minerais primários alteráveis (menos resistentes ao intemperismo). Excessivamente drenados, apresentando cores claras e baixa fertilidade natural, ocorrem em relevo plano e são desenvolvidos de materiais de origens sedimentares. Apesar da baixa fertilidade natural e da baixa retenção e disponibilidade de água, as altas taxas de infiltração e o relevo suave onde ocorrem, tornam estes solos pouco susceptíveis à erosão. Fotos 1 e 2.</w:t>
+        <w:t xml:space="preserve"> São solos profundos de textura arenosa, tendo nas frações areia grossa e areia fina 95% ou mais de quartzo, calcedônia e opala e, praticamente, ausência de minerais primários alteráveis (menos resistentes ao intemperismo). Excessivamente drenados, apresentando cores claras e baixa fertilidade natural, ocorrem em relevo plano e são desenvolvidos de materiais de origens sedimentares. Apesar da baixa fertilidade natural e da baixa retenção e disponibilidade de água, as altas taxas de infiltração e o relevo suave onde ocorrem, tornam estes solos pouco susceptíveis à erosão. Fotos 1 e 2.</w:t>
       </w:r>
     </w:p>
     <w:p>
@@ -1238,84 +665,24 @@
         </w:rPr>
         <w:t xml:space="preserve">Os </w:t>
       </w:r>
-      <w:proofErr w:type="spellStart"/>
-      <w:r>
-        <w:rPr>
-          <w:b/>
-          <w:color w:val="FF0000"/>
-        </w:rPr>
-        <w:t>Neossolos</w:t>
-      </w:r>
-      <w:proofErr w:type="spellEnd"/>
-      <w:r>
-        <w:rPr>
-          <w:b/>
+      <w:r>
+        <w:rPr>
+          <w:b/>
+          <w:color w:val="FF0000"/>
+        </w:rPr>
+        <w:t>Neossolos Litólicos</w:t>
+      </w:r>
+      <w:r>
+        <w:rPr>
           <w:color w:val="FF0000"/>
         </w:rPr>
         <w:t xml:space="preserve"> </w:t>
       </w:r>
-      <w:proofErr w:type="spellStart"/>
-      <w:r>
-        <w:rPr>
-          <w:b/>
-          <w:color w:val="FF0000"/>
-        </w:rPr>
-        <w:t>Litólicos</w:t>
-      </w:r>
-      <w:proofErr w:type="spellEnd"/>
-      <w:r>
-        <w:rPr>
-          <w:color w:val="FF0000"/>
-        </w:rPr>
-        <w:t xml:space="preserve"> </w:t>
-      </w:r>
       <w:r>
         <w:rPr>
           <w:color w:val="000000" w:themeColor="text1"/>
         </w:rPr>
-        <w:t xml:space="preserve">são rasos e na área apresentam textura arenosa e média São desenvolvidos de substratos rochosos constituídos por granitos e gnaisses, que, por vezes afloram, podendo ser acompanhado também por </w:t>
-      </w:r>
-      <w:proofErr w:type="spellStart"/>
-      <w:r>
-        <w:rPr>
-          <w:color w:val="000000" w:themeColor="text1"/>
-        </w:rPr>
-        <w:t>pedregosidade</w:t>
-      </w:r>
-      <w:proofErr w:type="spellEnd"/>
-      <w:r>
-        <w:rPr>
-          <w:color w:val="000000" w:themeColor="text1"/>
-        </w:rPr>
-        <w:t xml:space="preserve">. Ocupam posições na paisagem muito variadas, com relevo plano até montanhoso. Os principais fatores limitantes são: </w:t>
-      </w:r>
-      <w:proofErr w:type="spellStart"/>
-      <w:r>
-        <w:rPr>
-          <w:color w:val="000000" w:themeColor="text1"/>
-        </w:rPr>
-        <w:t>pedregosidade</w:t>
-      </w:r>
-      <w:proofErr w:type="spellEnd"/>
-      <w:r>
-        <w:rPr>
-          <w:color w:val="000000" w:themeColor="text1"/>
-        </w:rPr>
-        <w:t xml:space="preserve">, </w:t>
-      </w:r>
-      <w:proofErr w:type="spellStart"/>
-      <w:r>
-        <w:rPr>
-          <w:color w:val="000000" w:themeColor="text1"/>
-        </w:rPr>
-        <w:t>rochosidade</w:t>
-      </w:r>
-      <w:proofErr w:type="spellEnd"/>
-      <w:r>
-        <w:rPr>
-          <w:color w:val="000000" w:themeColor="text1"/>
-        </w:rPr>
-        <w:t xml:space="preserve"> e relevo.</w:t>
+        <w:t>são rasos e na área apresentam textura arenosa e média São desenvolvidos de substratos rochosos constituídos por granitos e gnaisses, que, por vezes afloram, podendo ser acompanhado também por pedregosidade. Ocupam posições na paisagem muito variadas, com relevo plano até montanhoso. Os principais fatores limitantes são: pedregosidade, rochosidade e relevo.</w:t>
       </w:r>
     </w:p>
     <w:p>
@@ -1341,7 +708,7 @@
           <w:szCs w:val="24"/>
         </w:rPr>
       </w:pPr>
-      <w:bookmarkStart w:id="4" w:name="_Hlk136437517"/>
+      <w:bookmarkStart w:id="5" w:name="_Hlk136437517"/>
       <w:r>
         <w:rPr>
           <w:rFonts w:ascii="Times New Roman" w:hAnsi="Times New Roman" w:cs="Times New Roman"/>
@@ -1375,129 +742,20 @@
           <w:sz w:val="24"/>
           <w:szCs w:val="24"/>
         </w:rPr>
-        <w:t>segundo o Sistema Brasileiro de Classificação dos Solos (</w:t>
-      </w:r>
-      <w:proofErr w:type="spellStart"/>
-      <w:r>
-        <w:rPr>
-          <w:rFonts w:ascii="Times New Roman" w:hAnsi="Times New Roman" w:cs="Times New Roman"/>
-          <w:sz w:val="24"/>
-          <w:szCs w:val="24"/>
-        </w:rPr>
-        <w:t>SiBCS</w:t>
-      </w:r>
-      <w:proofErr w:type="spellEnd"/>
-      <w:r>
-        <w:rPr>
-          <w:rFonts w:ascii="Times New Roman" w:hAnsi="Times New Roman" w:cs="Times New Roman"/>
-          <w:sz w:val="24"/>
-          <w:szCs w:val="24"/>
-        </w:rPr>
-        <w:t xml:space="preserve">) define esta classe de solos como solos constituídos por material mineral, apresentando horizonte </w:t>
-      </w:r>
-      <w:proofErr w:type="spellStart"/>
-      <w:r>
-        <w:rPr>
-          <w:rFonts w:ascii="Times New Roman" w:hAnsi="Times New Roman" w:cs="Times New Roman"/>
-          <w:sz w:val="24"/>
-          <w:szCs w:val="24"/>
-        </w:rPr>
-        <w:t>plíntico</w:t>
-      </w:r>
-      <w:proofErr w:type="spellEnd"/>
-      <w:r>
-        <w:rPr>
-          <w:rFonts w:ascii="Times New Roman" w:hAnsi="Times New Roman" w:cs="Times New Roman"/>
-          <w:sz w:val="24"/>
-          <w:szCs w:val="24"/>
-        </w:rPr>
-        <w:t xml:space="preserve">, </w:t>
-      </w:r>
-      <w:proofErr w:type="spellStart"/>
-      <w:r>
-        <w:rPr>
-          <w:rFonts w:ascii="Times New Roman" w:hAnsi="Times New Roman" w:cs="Times New Roman"/>
-          <w:sz w:val="24"/>
-          <w:szCs w:val="24"/>
-        </w:rPr>
-        <w:t>litoplíntico</w:t>
-      </w:r>
-      <w:proofErr w:type="spellEnd"/>
-      <w:r>
-        <w:rPr>
-          <w:rFonts w:ascii="Times New Roman" w:hAnsi="Times New Roman" w:cs="Times New Roman"/>
-          <w:sz w:val="24"/>
-          <w:szCs w:val="24"/>
-        </w:rPr>
-        <w:t xml:space="preserve"> ou </w:t>
-      </w:r>
-      <w:proofErr w:type="spellStart"/>
-      <w:r>
-        <w:rPr>
-          <w:rFonts w:ascii="Times New Roman" w:hAnsi="Times New Roman" w:cs="Times New Roman"/>
-          <w:sz w:val="24"/>
-          <w:szCs w:val="24"/>
-        </w:rPr>
-        <w:t>concrecionário</w:t>
-      </w:r>
-      <w:proofErr w:type="spellEnd"/>
-      <w:r>
-        <w:rPr>
-          <w:rFonts w:ascii="Times New Roman" w:hAnsi="Times New Roman" w:cs="Times New Roman"/>
-          <w:sz w:val="24"/>
-          <w:szCs w:val="24"/>
-        </w:rPr>
-        <w:t>, todos provenientes da segregação localizada de ferro, que atua como agente de cimentação (Embrapa, 2006). São fortemente ácidos, podem apresentar saturação por bases baixa (distróficos) ou alta (</w:t>
-      </w:r>
-      <w:proofErr w:type="spellStart"/>
-      <w:r>
-        <w:rPr>
-          <w:rFonts w:ascii="Times New Roman" w:hAnsi="Times New Roman" w:cs="Times New Roman"/>
-          <w:sz w:val="24"/>
-          <w:szCs w:val="24"/>
-        </w:rPr>
-        <w:t>eutróficos</w:t>
-      </w:r>
-      <w:proofErr w:type="spellEnd"/>
-      <w:r>
-        <w:rPr>
-          <w:rFonts w:ascii="Times New Roman" w:hAnsi="Times New Roman" w:cs="Times New Roman"/>
-          <w:sz w:val="24"/>
-          <w:szCs w:val="24"/>
-        </w:rPr>
-        <w:t xml:space="preserve">), predominando os de baixa saturação. Verificam-se também solos com propriedades </w:t>
-      </w:r>
-      <w:proofErr w:type="spellStart"/>
-      <w:r>
-        <w:rPr>
-          <w:rFonts w:ascii="Times New Roman" w:hAnsi="Times New Roman" w:cs="Times New Roman"/>
-          <w:sz w:val="24"/>
-          <w:szCs w:val="24"/>
-        </w:rPr>
-        <w:t>solódica</w:t>
-      </w:r>
-      <w:proofErr w:type="spellEnd"/>
-      <w:r>
-        <w:rPr>
-          <w:rFonts w:ascii="Times New Roman" w:hAnsi="Times New Roman" w:cs="Times New Roman"/>
-          <w:sz w:val="24"/>
-          <w:szCs w:val="24"/>
-        </w:rPr>
-        <w:t xml:space="preserve"> e sódica.</w:t>
-      </w:r>
-      <w:bookmarkEnd w:id="4"/>
-    </w:p>
-    <w:p>
-      <w:pPr>
-        <w:jc w:val="both"/>
-        <w:rPr>
-          <w:rFonts w:ascii="Times New Roman" w:hAnsi="Times New Roman" w:cs="Times New Roman"/>
-          <w:sz w:val="24"/>
-          <w:szCs w:val="24"/>
-        </w:rPr>
-      </w:pPr>
-      <w:bookmarkStart w:id="5" w:name="_Hlk141084856"/>
-      <w:proofErr w:type="spellStart"/>
+        <w:t>segundo o Sistema Brasileiro de Classificação dos Solos (SiBCS) define esta classe de solos como solos constituídos por material mineral, apresentando horizonte plíntico, litoplíntico ou concrecionário, todos provenientes da segregação localizada de ferro, que atua como agente de cimentação (Embrapa, 2006). São fortemente ácidos, podem apresentar saturação por bases baixa (distróficos) ou alta (eutróficos), predominando os de baixa saturação. Verificam-se também solos com propriedades solódica e sódica.</w:t>
+      </w:r>
+      <w:bookmarkEnd w:id="5"/>
+    </w:p>
+    <w:p>
+      <w:pPr>
+        <w:jc w:val="both"/>
+        <w:rPr>
+          <w:rFonts w:ascii="Times New Roman" w:hAnsi="Times New Roman" w:cs="Times New Roman"/>
+          <w:sz w:val="24"/>
+          <w:szCs w:val="24"/>
+        </w:rPr>
+      </w:pPr>
+      <w:bookmarkStart w:id="6" w:name="_Hlk141084856"/>
       <w:r>
         <w:rPr>
           <w:rFonts w:ascii="Times New Roman" w:hAnsi="Times New Roman" w:cs="Times New Roman"/>
@@ -1507,53 +765,16 @@
         </w:rPr>
         <w:t>Cambissolos</w:t>
       </w:r>
-      <w:proofErr w:type="spellEnd"/>
-      <w:r>
-        <w:rPr>
-          <w:rFonts w:ascii="Times New Roman" w:hAnsi="Times New Roman" w:cs="Times New Roman"/>
-          <w:sz w:val="24"/>
-          <w:szCs w:val="24"/>
-        </w:rPr>
-        <w:t xml:space="preserve"> são solos constituídos por material mineral com horizonte B incipiente subjacente a qualquer tipo de horizonte superficial (exceto </w:t>
-      </w:r>
-      <w:proofErr w:type="spellStart"/>
-      <w:r>
-        <w:rPr>
-          <w:rFonts w:ascii="Times New Roman" w:hAnsi="Times New Roman" w:cs="Times New Roman"/>
-          <w:sz w:val="24"/>
-          <w:szCs w:val="24"/>
-        </w:rPr>
-        <w:t>hístico</w:t>
-      </w:r>
-      <w:proofErr w:type="spellEnd"/>
-      <w:r>
-        <w:rPr>
-          <w:rFonts w:ascii="Times New Roman" w:hAnsi="Times New Roman" w:cs="Times New Roman"/>
-          <w:sz w:val="24"/>
-          <w:szCs w:val="24"/>
-        </w:rPr>
-        <w:t xml:space="preserve"> com 40 cm ou mais de espessura) ou horizonte A </w:t>
-      </w:r>
-      <w:proofErr w:type="spellStart"/>
-      <w:r>
-        <w:rPr>
-          <w:rFonts w:ascii="Times New Roman" w:hAnsi="Times New Roman" w:cs="Times New Roman"/>
-          <w:sz w:val="24"/>
-          <w:szCs w:val="24"/>
-        </w:rPr>
-        <w:t>chernozêmico</w:t>
-      </w:r>
-      <w:proofErr w:type="spellEnd"/>
-      <w:r>
-        <w:rPr>
-          <w:rFonts w:ascii="Times New Roman" w:hAnsi="Times New Roman" w:cs="Times New Roman"/>
-          <w:sz w:val="24"/>
-          <w:szCs w:val="24"/>
-        </w:rPr>
-        <w:t xml:space="preserve"> quando o B incipiente apresentar argila de atividade alta e saturação por bases alta.</w:t>
-      </w:r>
-    </w:p>
-    <w:bookmarkEnd w:id="5"/>
+      <w:r>
+        <w:rPr>
+          <w:rFonts w:ascii="Times New Roman" w:hAnsi="Times New Roman" w:cs="Times New Roman"/>
+          <w:sz w:val="24"/>
+          <w:szCs w:val="24"/>
+        </w:rPr>
+        <w:t xml:space="preserve"> são solos constituídos por material mineral com horizonte B incipiente subjacente a qualquer tipo de horizonte superficial (exceto hístico com 40 cm ou mais de espessura) ou horizonte A chernozêmico quando o B incipiente apresentar argila de atividade alta e saturação por bases alta.</w:t>
+      </w:r>
+    </w:p>
+    <w:bookmarkEnd w:id="6"/>
     <w:p>
       <w:pPr>
         <w:jc w:val="both"/>
@@ -1631,68 +852,23 @@
           <w:szCs w:val="24"/>
         </w:rPr>
         <w:lastRenderedPageBreak/>
-        <w:t xml:space="preserve"> A (declive igual ou inferior a 5%):</w:t>
-      </w:r>
-      <w:r>
-        <w:rPr>
-          <w:rFonts w:ascii="Times New Roman" w:hAnsi="Times New Roman" w:cs="Times New Roman"/>
-          <w:color w:val="FF0000"/>
-          <w:sz w:val="24"/>
-          <w:szCs w:val="24"/>
-        </w:rPr>
         <w:t xml:space="preserve"> </w:t>
       </w:r>
       <w:r>
         <w:rPr>
           <w:rFonts w:ascii="Times New Roman" w:hAnsi="Times New Roman" w:cs="Times New Roman"/>
-          <w:sz w:val="24"/>
-          <w:szCs w:val="24"/>
-        </w:rPr>
-        <w:t xml:space="preserve">predominância de áreas com declives suaves, nos quais, na maior parte dos solos, o escoamento superficial é lento ou médio. O declive, por si só, não impede ou dificulta o trabalho de qualquer tipo de máquina agrícola mais usual. A erosão hídrica não oferece maiores problemas. Em alguns tipos de solos, práticas mais simples de conservação são recomendáveis. Para aqueles muito </w:t>
-      </w:r>
-      <w:proofErr w:type="spellStart"/>
-      <w:r>
-        <w:rPr>
-          <w:rFonts w:ascii="Times New Roman" w:hAnsi="Times New Roman" w:cs="Times New Roman"/>
-          <w:sz w:val="24"/>
-          <w:szCs w:val="24"/>
-        </w:rPr>
-        <w:t>erodíveis</w:t>
-      </w:r>
-      <w:proofErr w:type="spellEnd"/>
-      <w:r>
-        <w:rPr>
-          <w:rFonts w:ascii="Times New Roman" w:hAnsi="Times New Roman" w:cs="Times New Roman"/>
-          <w:sz w:val="24"/>
-          <w:szCs w:val="24"/>
-        </w:rPr>
-        <w:t xml:space="preserve"> com comprimentos de rampa muito longos, práticas complexas podem ser necessárias, tais como sistemas de terraços e faixas de retenção.</w:t>
-      </w:r>
-    </w:p>
-    <w:p>
-      <w:pPr>
-        <w:jc w:val="both"/>
-        <w:rPr>
-          <w:rFonts w:ascii="Times New Roman" w:hAnsi="Times New Roman" w:cs="Times New Roman"/>
-          <w:sz w:val="24"/>
-          <w:szCs w:val="24"/>
-        </w:rPr>
-      </w:pPr>
-      <w:r>
-        <w:rPr>
-          <w:rFonts w:ascii="Times New Roman" w:hAnsi="Times New Roman" w:cs="Times New Roman"/>
           <w:b/>
           <w:bCs/>
-          <w:color w:val="FF0000"/>
-          <w:sz w:val="24"/>
-          <w:szCs w:val="24"/>
-        </w:rPr>
-        <w:t xml:space="preserve"> B (declive maior que 5% e igual ou inferior a 10%):</w:t>
-      </w:r>
-      <w:r>
-        <w:rPr>
-          <w:rFonts w:ascii="Times New Roman" w:hAnsi="Times New Roman" w:cs="Times New Roman"/>
-          <w:color w:val="FF0000"/>
+          <w:color w:val="70AD47" w:themeColor="accent6"/>
+          <w:sz w:val="24"/>
+          <w:szCs w:val="24"/>
+        </w:rPr>
+        <w:t>A (declive igual ou inferior a 5%):</w:t>
+      </w:r>
+      <w:r>
+        <w:rPr>
+          <w:rFonts w:ascii="Times New Roman" w:hAnsi="Times New Roman" w:cs="Times New Roman"/>
+          <w:color w:val="70AD47" w:themeColor="accent6"/>
           <w:sz w:val="24"/>
           <w:szCs w:val="24"/>
         </w:rPr>
@@ -1704,6 +880,55 @@
           <w:sz w:val="24"/>
           <w:szCs w:val="24"/>
         </w:rPr>
+        <w:t>predominância de áreas com declives suaves, nos quais, na maior parte dos solos, o escoamento superficial é lento ou médio. O declive, por si só, não impede ou dificulta o trabalho de qualquer tipo de máquina agrícola mais usual. A erosão hídrica não oferece maiores problemas. Em alguns tipos de solos, práticas mais simples de conservação são recomendáveis. Para aqueles muito erodíveis com comprimentos de rampa muito longos, práticas complexas podem ser necessárias, tais como sistemas de terraços e faixas de retenção.</w:t>
+      </w:r>
+    </w:p>
+    <w:p>
+      <w:pPr>
+        <w:jc w:val="both"/>
+        <w:rPr>
+          <w:rFonts w:ascii="Times New Roman" w:hAnsi="Times New Roman" w:cs="Times New Roman"/>
+          <w:sz w:val="24"/>
+          <w:szCs w:val="24"/>
+        </w:rPr>
+      </w:pPr>
+      <w:r>
+        <w:rPr>
+          <w:rFonts w:ascii="Times New Roman" w:hAnsi="Times New Roman" w:cs="Times New Roman"/>
+          <w:b/>
+          <w:bCs/>
+          <w:color w:val="FF0000"/>
+          <w:sz w:val="24"/>
+          <w:szCs w:val="24"/>
+        </w:rPr>
+        <w:t xml:space="preserve"> </w:t>
+      </w:r>
+      <w:r>
+        <w:rPr>
+          <w:rFonts w:ascii="Times New Roman" w:hAnsi="Times New Roman" w:cs="Times New Roman"/>
+          <w:b/>
+          <w:bCs/>
+          <w:color w:val="70AD47" w:themeColor="accent6"/>
+          <w:sz w:val="24"/>
+          <w:szCs w:val="24"/>
+        </w:rPr>
+        <w:t>B (declive maior que 5% e igual ou inferior a 10%):</w:t>
+      </w:r>
+      <w:r>
+        <w:rPr>
+          <w:rFonts w:ascii="Times New Roman" w:hAnsi="Times New Roman" w:cs="Times New Roman"/>
+          <w:color w:val="70AD47" w:themeColor="accent6"/>
+          <w:sz w:val="24"/>
+          <w:szCs w:val="24"/>
+        </w:rPr>
+        <w:t xml:space="preserve"> </w:t>
+      </w:r>
+      <w:r>
+        <w:rPr>
+          <w:rFonts w:ascii="Times New Roman" w:hAnsi="Times New Roman" w:cs="Times New Roman"/>
+          <w:sz w:val="24"/>
+          <w:szCs w:val="24"/>
+        </w:rPr>
         <w:t xml:space="preserve">predominância de áreas com superfícies inclinadas, geralmente com relevo ondulado, nos quais o escoamento superficial, para a maior parte dos solos, é médio ou rápido. O declive, por si só, normalmente não prejudica o uso de máquinas agrícolas. Em alguns casos, a erosão hídrica oferece pequenos problemas que podem ser controlados com práticas simples, mas na maior parte das vezes, práticas complexas de conservação do solo são necessárias para que terras com esse declive possam ser cultivadas intensivamente. </w:t>
       </w:r>
     </w:p>
@@ -1721,7 +946,7 @@
           <w:rFonts w:ascii="Times New Roman" w:hAnsi="Times New Roman" w:cs="Times New Roman"/>
           <w:b/>
           <w:bCs/>
-          <w:color w:val="FF0000"/>
+          <w:color w:val="70AD47" w:themeColor="accent6"/>
           <w:sz w:val="24"/>
           <w:szCs w:val="24"/>
         </w:rPr>
@@ -1730,7 +955,7 @@
       <w:r>
         <w:rPr>
           <w:rFonts w:ascii="Times New Roman" w:hAnsi="Times New Roman" w:cs="Times New Roman"/>
-          <w:color w:val="FF0000"/>
+          <w:color w:val="70AD47" w:themeColor="accent6"/>
           <w:sz w:val="24"/>
           <w:szCs w:val="24"/>
         </w:rPr>
@@ -1742,44 +967,26 @@
           <w:sz w:val="24"/>
           <w:szCs w:val="24"/>
         </w:rPr>
-        <w:t xml:space="preserve">predominância de áreas inclinadas ou colinosas, onde o escoamento superficial é rápido na maior parte dos solos. A não ser que o declive seja muito complexo, a maior parte das máquinas agrícolas podem ser usadas. Solos desta classe são facilmente </w:t>
-      </w:r>
-      <w:proofErr w:type="spellStart"/>
-      <w:r>
-        <w:rPr>
-          <w:rFonts w:ascii="Times New Roman" w:hAnsi="Times New Roman" w:cs="Times New Roman"/>
-          <w:sz w:val="24"/>
-          <w:szCs w:val="24"/>
-        </w:rPr>
-        <w:t>erodíveis</w:t>
-      </w:r>
-      <w:proofErr w:type="spellEnd"/>
-      <w:r>
-        <w:rPr>
-          <w:rFonts w:ascii="Times New Roman" w:hAnsi="Times New Roman" w:cs="Times New Roman"/>
-          <w:sz w:val="24"/>
-          <w:szCs w:val="24"/>
-        </w:rPr>
-        <w:t>, exceto aqueles muito permeáveis e não muito arenosos, como alguns latossolos. Em todas estas situações, práticas de conservação do solo são recomendadas e necessárias.</w:t>
-      </w:r>
-    </w:p>
-    <w:p>
-      <w:pPr>
-        <w:jc w:val="both"/>
-        <w:rPr>
-          <w:rFonts w:ascii="Times New Roman" w:hAnsi="Times New Roman" w:cs="Times New Roman"/>
-          <w:sz w:val="24"/>
-          <w:szCs w:val="24"/>
-        </w:rPr>
-      </w:pPr>
-      <w:bookmarkStart w:id="6" w:name="_Hlk153461595"/>
-      <w:bookmarkStart w:id="7" w:name="_Hlk137032584"/>
+        <w:t>predominância de áreas inclinadas ou colinosas, onde o escoamento superficial é rápido na maior parte dos solos. A não ser que o declive seja muito complexo, a maior parte das máquinas agrícolas podem ser usadas. Solos desta classe são facilmente erodíveis, exceto aqueles muito permeáveis e não muito arenosos, como alguns latossolos. Em todas estas situações, práticas de conservação do solo são recomendadas e necessárias.</w:t>
+      </w:r>
+    </w:p>
+    <w:p>
+      <w:pPr>
+        <w:jc w:val="both"/>
+        <w:rPr>
+          <w:rFonts w:ascii="Times New Roman" w:hAnsi="Times New Roman" w:cs="Times New Roman"/>
+          <w:sz w:val="24"/>
+          <w:szCs w:val="24"/>
+        </w:rPr>
+      </w:pPr>
+      <w:bookmarkStart w:id="7" w:name="_Hlk153461595"/>
+      <w:bookmarkStart w:id="8" w:name="_Hlk137032584"/>
       <w:r>
         <w:rPr>
           <w:rFonts w:ascii="Times New Roman" w:hAnsi="Times New Roman" w:cs="Times New Roman"/>
           <w:b/>
           <w:bCs/>
-          <w:color w:val="FF0000"/>
+          <w:color w:val="70AD47" w:themeColor="accent6"/>
           <w:sz w:val="24"/>
           <w:szCs w:val="24"/>
         </w:rPr>
@@ -1788,7 +995,7 @@
       <w:r>
         <w:rPr>
           <w:rFonts w:ascii="Times New Roman" w:hAnsi="Times New Roman" w:cs="Times New Roman"/>
-          <w:color w:val="FF0000"/>
+          <w:color w:val="70AD47" w:themeColor="accent6"/>
           <w:sz w:val="24"/>
           <w:szCs w:val="24"/>
         </w:rPr>
@@ -1802,7 +1009,7 @@
         </w:rPr>
         <w:t>predominância de áreas inclinadas a fortemente inclinadas, cujo escoamento superficial é rápido a muito rápido na maior parte dos solos. Podem ser trabalhados mecanicamente apenas em curvas de nível por máquinas simples de tração animal ou com limitações e cuidados especiais por tratores de esteira. Em terras nessa situação não é recomendável a prática de agricultura intensiva. São mais indicadas para pastagem natural e/ou silvicultura</w:t>
       </w:r>
-      <w:bookmarkEnd w:id="6"/>
+      <w:bookmarkEnd w:id="7"/>
       <w:r>
         <w:rPr>
           <w:rFonts w:ascii="Times New Roman" w:hAnsi="Times New Roman" w:cs="Times New Roman"/>
@@ -1811,7 +1018,7 @@
         </w:rPr>
         <w:t>.</w:t>
       </w:r>
-      <w:bookmarkEnd w:id="7"/>
+      <w:bookmarkEnd w:id="8"/>
     </w:p>
     <w:p>
       <w:pPr>
@@ -1827,7 +1034,7 @@
           <w:rFonts w:ascii="Times New Roman" w:hAnsi="Times New Roman" w:cs="Times New Roman"/>
           <w:b/>
           <w:bCs/>
-          <w:color w:val="FF0000"/>
+          <w:color w:val="70AD47" w:themeColor="accent6"/>
           <w:sz w:val="24"/>
           <w:szCs w:val="24"/>
         </w:rPr>
@@ -1865,7 +1072,7 @@
           <w:rFonts w:ascii="Times New Roman" w:hAnsi="Times New Roman" w:cs="Times New Roman"/>
           <w:b/>
           <w:bCs/>
-          <w:color w:val="FF0000"/>
+          <w:color w:val="70AD47" w:themeColor="accent6"/>
           <w:sz w:val="24"/>
           <w:szCs w:val="24"/>
         </w:rPr>
@@ -1874,7 +1081,7 @@
       <w:r>
         <w:rPr>
           <w:rFonts w:ascii="Times New Roman" w:hAnsi="Times New Roman" w:cs="Times New Roman"/>
-          <w:color w:val="FF0000"/>
+          <w:color w:val="70AD47" w:themeColor="accent6"/>
           <w:sz w:val="24"/>
           <w:szCs w:val="24"/>
         </w:rPr>
@@ -1955,7 +1162,7 @@
       <w:r>
         <w:rPr>
           <w:rFonts w:ascii="Times New Roman" w:hAnsi="Times New Roman" w:cs="Times New Roman"/>
-          <w:color w:val="FF0000"/>
+          <w:color w:val="70AD47" w:themeColor="accent6"/>
           <w:sz w:val="24"/>
           <w:szCs w:val="24"/>
         </w:rPr>
@@ -1983,7 +1190,7 @@
       <w:r>
         <w:rPr>
           <w:rFonts w:ascii="Times New Roman" w:hAnsi="Times New Roman" w:cs="Times New Roman"/>
-          <w:color w:val="FF0000"/>
+          <w:color w:val="70AD47" w:themeColor="accent6"/>
           <w:sz w:val="24"/>
           <w:szCs w:val="24"/>
         </w:rPr>
@@ -2010,34 +1217,34 @@
       <w:r>
         <w:rPr>
           <w:rFonts w:ascii="Times New Roman" w:hAnsi="Times New Roman" w:cs="Times New Roman"/>
-          <w:color w:val="FF0000"/>
-          <w:sz w:val="24"/>
-          <w:szCs w:val="24"/>
-        </w:rPr>
-        <w:t>BC</w:t>
-      </w:r>
-      <w:r>
-        <w:rPr>
-          <w:rFonts w:ascii="Times New Roman" w:hAnsi="Times New Roman" w:cs="Times New Roman"/>
-          <w:sz w:val="24"/>
-          <w:szCs w:val="24"/>
-        </w:rPr>
-        <w:t xml:space="preserve"> – Mosaico com predomínio de B sobre C </w:t>
-      </w:r>
-    </w:p>
-    <w:p>
-      <w:pPr>
-        <w:jc w:val="both"/>
-        <w:rPr>
-          <w:rFonts w:ascii="Times New Roman" w:hAnsi="Times New Roman" w:cs="Times New Roman"/>
-          <w:sz w:val="24"/>
-          <w:szCs w:val="24"/>
-        </w:rPr>
-      </w:pPr>
-      <w:r>
-        <w:rPr>
-          <w:rFonts w:ascii="Times New Roman" w:hAnsi="Times New Roman" w:cs="Times New Roman"/>
-          <w:color w:val="FF0000"/>
+          <w:color w:val="70AD47" w:themeColor="accent6"/>
+          <w:sz w:val="24"/>
+          <w:szCs w:val="24"/>
+        </w:rPr>
+        <w:t xml:space="preserve">BC </w:t>
+      </w:r>
+      <w:r>
+        <w:rPr>
+          <w:rFonts w:ascii="Times New Roman" w:hAnsi="Times New Roman" w:cs="Times New Roman"/>
+          <w:sz w:val="24"/>
+          <w:szCs w:val="24"/>
+        </w:rPr>
+        <w:t xml:space="preserve">– Mosaico com predomínio de B sobre C </w:t>
+      </w:r>
+    </w:p>
+    <w:p>
+      <w:pPr>
+        <w:jc w:val="both"/>
+        <w:rPr>
+          <w:rFonts w:ascii="Times New Roman" w:hAnsi="Times New Roman" w:cs="Times New Roman"/>
+          <w:sz w:val="24"/>
+          <w:szCs w:val="24"/>
+        </w:rPr>
+      </w:pPr>
+      <w:r>
+        <w:rPr>
+          <w:rFonts w:ascii="Times New Roman" w:hAnsi="Times New Roman" w:cs="Times New Roman"/>
+          <w:color w:val="70AD47" w:themeColor="accent6"/>
           <w:sz w:val="24"/>
           <w:szCs w:val="24"/>
         </w:rPr>
@@ -2064,11 +1271,20 @@
       <w:r>
         <w:rPr>
           <w:rFonts w:ascii="Times New Roman" w:hAnsi="Times New Roman" w:cs="Times New Roman"/>
-          <w:color w:val="FF0000"/>
-          <w:sz w:val="24"/>
-          <w:szCs w:val="24"/>
-        </w:rPr>
-        <w:t xml:space="preserve">CD </w:t>
+          <w:color w:val="70AD47" w:themeColor="accent6"/>
+          <w:sz w:val="24"/>
+          <w:szCs w:val="24"/>
+        </w:rPr>
+        <w:t>CD</w:t>
+      </w:r>
+      <w:r>
+        <w:rPr>
+          <w:rFonts w:ascii="Times New Roman" w:hAnsi="Times New Roman" w:cs="Times New Roman"/>
+          <w:color w:val="FF0000"/>
+          <w:sz w:val="24"/>
+          <w:szCs w:val="24"/>
+        </w:rPr>
+        <w:t xml:space="preserve"> </w:t>
       </w:r>
       <w:r>
         <w:rPr>
@@ -2091,7 +1307,7 @@
       <w:r>
         <w:rPr>
           <w:rFonts w:ascii="Times New Roman" w:hAnsi="Times New Roman" w:cs="Times New Roman"/>
-          <w:color w:val="FF0000"/>
+          <w:color w:val="70AD47" w:themeColor="accent6"/>
           <w:sz w:val="24"/>
           <w:szCs w:val="24"/>
         </w:rPr>
@@ -2147,7 +1363,7 @@
 </file>
 
 <file path=word/endnotes.xml><?xml version="1.0" encoding="utf-8"?>
-<w:endnotes xmlns:wpc="http://schemas.microsoft.com/office/word/2010/wordprocessingCanvas" xmlns:cx="http://schemas.microsoft.com/office/drawing/2014/chartex" xmlns:cx1="http://schemas.microsoft.com/office/drawing/2015/9/8/chartex" xmlns:cx2="http://schemas.microsoft.com/office/drawing/2015/10/21/chartex" xmlns:cx3="http://schemas.microsoft.com/office/drawing/2016/5/9/chartex" xmlns:cx4="http://schemas.microsoft.com/office/drawing/2016/5/10/chartex" xmlns:cx5="http://schemas.microsoft.com/office/drawing/2016/5/11/chartex" xmlns:cx6="http://schemas.microsoft.com/office/drawing/2016/5/12/chartex" xmlns:cx7="http://schemas.microsoft.com/office/drawing/2016/5/13/chartex" xmlns:cx8="http://schemas.microsoft.com/office/drawing/2016/5/14/chartex" xmlns:mc="http://schemas.openxmlformats.org/markup-compatibility/2006" xmlns:aink="http://schemas.microsoft.com/office/drawing/2016/ink" xmlns:am3d="http://schemas.microsoft.com/office/drawing/2017/model3d" xmlns:o="urn:schemas-microsoft-com:office:office" xmlns:oel="http://schemas.microsoft.com/office/2019/extlst" xmlns:r="http://schemas.openxmlformats.org/officeDocument/2006/relationships" xmlns:m="http://schemas.openxmlformats.org/officeDocument/2006/math" xmlns:v="urn:schemas-microsoft-com:vml" xmlns:wp14="http://schemas.microsoft.com/office/word/2010/wordprocessingDrawing" xmlns:wp="http://schemas.openxmlformats.org/drawingml/2006/wordprocessingDrawing" xmlns:w10="urn:schemas-microsoft-com:office:word" xmlns:w="http://schemas.openxmlformats.org/wordprocessingml/2006/main" xmlns:w14="http://schemas.microsoft.com/office/word/2010/wordml" xmlns:w15="http://schemas.microsoft.com/office/word/2012/wordml" xmlns:w16cex="http://schemas.microsoft.com/office/word/2018/wordml/cex" xmlns:w16cid="http://schemas.microsoft.com/office/word/2016/wordml/cid" xmlns:w16="http://schemas.microsoft.com/office/word/2018/wordml" xmlns:w16du="http://schemas.microsoft.com/office/word/2023/wordml/word16du" xmlns:w16sdtdh="http://schemas.microsoft.com/office/word/2020/wordml/sdtdatahash" xmlns:w16sdtfl="http://schemas.microsoft.com/office/word/2024/wordml/sdtformatlock" xmlns:w16se="http://schemas.microsoft.com/office/word/2015/wordml/symex" xmlns:wpg="http://schemas.microsoft.com/office/word/2010/wordprocessingGroup" xmlns:wpi="http://schemas.microsoft.com/office/word/2010/wordprocessingInk" xmlns:wne="http://schemas.microsoft.com/office/word/2006/wordml" xmlns:wps="http://schemas.microsoft.com/office/word/2010/wordprocessingShape" mc:Ignorable="w14 w15 w16se w16cid w16 w16cex w16sdtdh w16sdtfl w16du wp14">
+<w:endnotes xmlns:wpc="http://schemas.microsoft.com/office/word/2010/wordprocessingCanvas" xmlns:cx="http://schemas.microsoft.com/office/drawing/2014/chartex" xmlns:mc="http://schemas.openxmlformats.org/markup-compatibility/2006" xmlns:o="urn:schemas-microsoft-com:office:office" xmlns:r="http://schemas.openxmlformats.org/officeDocument/2006/relationships" xmlns:m="http://schemas.openxmlformats.org/officeDocument/2006/math" xmlns:v="urn:schemas-microsoft-com:vml" xmlns:wp14="http://schemas.microsoft.com/office/word/2010/wordprocessingDrawing" xmlns:wp="http://schemas.openxmlformats.org/drawingml/2006/wordprocessingDrawing" xmlns:w10="urn:schemas-microsoft-com:office:word" xmlns:w="http://schemas.openxmlformats.org/wordprocessingml/2006/main" xmlns:w14="http://schemas.microsoft.com/office/word/2010/wordml" xmlns:w15="http://schemas.microsoft.com/office/word/2012/wordml" xmlns:w16se="http://schemas.microsoft.com/office/word/2015/wordml/symex" xmlns:wpg="http://schemas.microsoft.com/office/word/2010/wordprocessingGroup" xmlns:wpi="http://schemas.microsoft.com/office/word/2010/wordprocessingInk" xmlns:wne="http://schemas.microsoft.com/office/word/2006/wordml" xmlns:wps="http://schemas.microsoft.com/office/word/2010/wordprocessingShape" mc:Ignorable="w14 w15 w16se wp14">
   <w:endnote w:type="separator" w:id="-1">
     <w:p>
       <w:pPr>
@@ -2172,7 +1388,7 @@
 </file>
 
 <file path=word/footnotes.xml><?xml version="1.0" encoding="utf-8"?>
-<w:footnotes xmlns:wpc="http://schemas.microsoft.com/office/word/2010/wordprocessingCanvas" xmlns:cx="http://schemas.microsoft.com/office/drawing/2014/chartex" xmlns:cx1="http://schemas.microsoft.com/office/drawing/2015/9/8/chartex" xmlns:cx2="http://schemas.microsoft.com/office/drawing/2015/10/21/chartex" xmlns:cx3="http://schemas.microsoft.com/office/drawing/2016/5/9/chartex" xmlns:cx4="http://schemas.microsoft.com/office/drawing/2016/5/10/chartex" xmlns:cx5="http://schemas.microsoft.com/office/drawing/2016/5/11/chartex" xmlns:cx6="http://schemas.microsoft.com/office/drawing/2016/5/12/chartex" xmlns:cx7="http://schemas.microsoft.com/office/drawing/2016/5/13/chartex" xmlns:cx8="http://schemas.microsoft.com/office/drawing/2016/5/14/chartex" xmlns:mc="http://schemas.openxmlformats.org/markup-compatibility/2006" xmlns:aink="http://schemas.microsoft.com/office/drawing/2016/ink" xmlns:am3d="http://schemas.microsoft.com/office/drawing/2017/model3d" xmlns:o="urn:schemas-microsoft-com:office:office" xmlns:oel="http://schemas.microsoft.com/office/2019/extlst" xmlns:r="http://schemas.openxmlformats.org/officeDocument/2006/relationships" xmlns:m="http://schemas.openxmlformats.org/officeDocument/2006/math" xmlns:v="urn:schemas-microsoft-com:vml" xmlns:wp14="http://schemas.microsoft.com/office/word/2010/wordprocessingDrawing" xmlns:wp="http://schemas.openxmlformats.org/drawingml/2006/wordprocessingDrawing" xmlns:w10="urn:schemas-microsoft-com:office:word" xmlns:w="http://schemas.openxmlformats.org/wordprocessingml/2006/main" xmlns:w14="http://schemas.microsoft.com/office/word/2010/wordml" xmlns:w15="http://schemas.microsoft.com/office/word/2012/wordml" xmlns:w16cex="http://schemas.microsoft.com/office/word/2018/wordml/cex" xmlns:w16cid="http://schemas.microsoft.com/office/word/2016/wordml/cid" xmlns:w16="http://schemas.microsoft.com/office/word/2018/wordml" xmlns:w16du="http://schemas.microsoft.com/office/word/2023/wordml/word16du" xmlns:w16sdtdh="http://schemas.microsoft.com/office/word/2020/wordml/sdtdatahash" xmlns:w16sdtfl="http://schemas.microsoft.com/office/word/2024/wordml/sdtformatlock" xmlns:w16se="http://schemas.microsoft.com/office/word/2015/wordml/symex" xmlns:wpg="http://schemas.microsoft.com/office/word/2010/wordprocessingGroup" xmlns:wpi="http://schemas.microsoft.com/office/word/2010/wordprocessingInk" xmlns:wne="http://schemas.microsoft.com/office/word/2006/wordml" xmlns:wps="http://schemas.microsoft.com/office/word/2010/wordprocessingShape" mc:Ignorable="w14 w15 w16se w16cid w16 w16cex w16sdtdh w16sdtfl w16du wp14">
+<w:footnotes xmlns:wpc="http://schemas.microsoft.com/office/word/2010/wordprocessingCanvas" xmlns:cx="http://schemas.microsoft.com/office/drawing/2014/chartex" xmlns:mc="http://schemas.openxmlformats.org/markup-compatibility/2006" xmlns:o="urn:schemas-microsoft-com:office:office" xmlns:r="http://schemas.openxmlformats.org/officeDocument/2006/relationships" xmlns:m="http://schemas.openxmlformats.org/officeDocument/2006/math" xmlns:v="urn:schemas-microsoft-com:vml" xmlns:wp14="http://schemas.microsoft.com/office/word/2010/wordprocessingDrawing" xmlns:wp="http://schemas.openxmlformats.org/drawingml/2006/wordprocessingDrawing" xmlns:w10="urn:schemas-microsoft-com:office:word" xmlns:w="http://schemas.openxmlformats.org/wordprocessingml/2006/main" xmlns:w14="http://schemas.microsoft.com/office/word/2010/wordml" xmlns:w15="http://schemas.microsoft.com/office/word/2012/wordml" xmlns:w16se="http://schemas.microsoft.com/office/word/2015/wordml/symex" xmlns:wpg="http://schemas.microsoft.com/office/word/2010/wordprocessingGroup" xmlns:wpi="http://schemas.microsoft.com/office/word/2010/wordprocessingInk" xmlns:wne="http://schemas.microsoft.com/office/word/2006/wordml" xmlns:wps="http://schemas.microsoft.com/office/word/2010/wordprocessingShape" mc:Ignorable="w14 w15 w16se wp14">
   <w:footnote w:type="separator" w:id="-1">
     <w:p>
       <w:pPr>
@@ -2197,7 +1413,7 @@
 </file>
 
 <file path=word/styles.xml><?xml version="1.0" encoding="utf-8"?>
-<w:styles xmlns:mc="http://schemas.openxmlformats.org/markup-compatibility/2006" xmlns:r="http://schemas.openxmlformats.org/officeDocument/2006/relationships" xmlns:w="http://schemas.openxmlformats.org/wordprocessingml/2006/main" xmlns:w14="http://schemas.microsoft.com/office/word/2010/wordml" xmlns:w15="http://schemas.microsoft.com/office/word/2012/wordml" xmlns:w16cex="http://schemas.microsoft.com/office/word/2018/wordml/cex" xmlns:w16cid="http://schemas.microsoft.com/office/word/2016/wordml/cid" xmlns:w16="http://schemas.microsoft.com/office/word/2018/wordml" xmlns:w16du="http://schemas.microsoft.com/office/word/2023/wordml/word16du" xmlns:w16sdtdh="http://schemas.microsoft.com/office/word/2020/wordml/sdtdatahash" xmlns:w16sdtfl="http://schemas.microsoft.com/office/word/2024/wordml/sdtformatlock" xmlns:w16se="http://schemas.microsoft.com/office/word/2015/wordml/symex" mc:Ignorable="w14 w15 w16se w16cid w16 w16cex w16sdtdh w16sdtfl w16du">
+<w:styles xmlns:mc="http://schemas.openxmlformats.org/markup-compatibility/2006" xmlns:r="http://schemas.openxmlformats.org/officeDocument/2006/relationships" xmlns:w="http://schemas.openxmlformats.org/wordprocessingml/2006/main" xmlns:w14="http://schemas.microsoft.com/office/word/2010/wordml" xmlns:w15="http://schemas.microsoft.com/office/word/2012/wordml" xmlns:w16se="http://schemas.microsoft.com/office/word/2015/wordml/symex" mc:Ignorable="w14 w15 w16se">
   <w:docDefaults>
     <w:rPrDefault>
       <w:rPr>
@@ -2213,7 +1429,7 @@
       </w:pPr>
     </w:pPrDefault>
   </w:docDefaults>
-  <w:latentStyles w:defLockedState="0" w:defUIPriority="99" w:defSemiHidden="0" w:defUnhideWhenUsed="0" w:defQFormat="0" w:count="376">
+  <w:latentStyles w:defLockedState="0" w:defUIPriority="99" w:defSemiHidden="0" w:defUnhideWhenUsed="0" w:defQFormat="0" w:count="371">
     <w:lsdException w:name="Normal" w:uiPriority="0" w:qFormat="1"/>
     <w:lsdException w:name="heading 1" w:uiPriority="9" w:qFormat="1"/>
     <w:lsdException w:name="heading 2" w:semiHidden="1" w:uiPriority="9" w:unhideWhenUsed="1" w:qFormat="1"/>
@@ -2585,11 +1801,6 @@
     <w:lsdException w:name="List Table 5 Dark Accent 6" w:uiPriority="50"/>
     <w:lsdException w:name="List Table 6 Colorful Accent 6" w:uiPriority="51"/>
     <w:lsdException w:name="List Table 7 Colorful Accent 6" w:uiPriority="52"/>
-    <w:lsdException w:name="Mention" w:semiHidden="1" w:unhideWhenUsed="1"/>
-    <w:lsdException w:name="Smart Hyperlink" w:semiHidden="1" w:unhideWhenUsed="1"/>
-    <w:lsdException w:name="Hashtag" w:semiHidden="1" w:unhideWhenUsed="1"/>
-    <w:lsdException w:name="Unresolved Mention" w:semiHidden="1" w:unhideWhenUsed="1"/>
-    <w:lsdException w:name="Smart Link" w:semiHidden="1" w:unhideWhenUsed="1"/>
   </w:latentStyles>
   <w:style w:type="paragraph" w:default="1" w:styleId="Normal">
     <w:name w:val="Normal"/>

</xml_diff>

<commit_message>
multipla seleção de solos, arquivos para kml, arquivos para inserção e tabela de solos
</commit_message>
<xml_diff>
--- a/models/DECLIVIDADE e PEDOLOGIA.docx
+++ b/models/DECLIVIDADE e PEDOLOGIA.docx
@@ -23,7 +23,7 @@
           <w:sz w:val="24"/>
           <w:szCs w:val="24"/>
         </w:rPr>
-        <w:object w:dxaOrig="8504" w:dyaOrig="13953" w14:anchorId="780638B7">
+        <w:object w:dxaOrig="8750" w:dyaOrig="13885" w14:anchorId="780638B7">
           <v:shapetype id="_x0000_t75" coordsize="21600,21600" o:spt="75" o:preferrelative="t" path="m@4@5l@4@11@9@11@9@5xe" filled="f" stroked="f">
             <v:stroke joinstyle="miter"/>
             <v:formulas>
@@ -43,10 +43,10 @@
             <v:path o:extrusionok="f" gradientshapeok="t" o:connecttype="rect"/>
             <o:lock v:ext="edit" aspectratio="t"/>
           </v:shapetype>
-          <v:shape id="_x0000_i1030" type="#_x0000_t75" style="width:425.25pt;height:697.5pt" o:ole="">
+          <v:shape id="_x0000_i1029" type="#_x0000_t75" style="width:437.25pt;height:694.5pt" o:ole="">
             <v:imagedata r:id="rId6" o:title=""/>
           </v:shape>
-          <o:OLEObject Type="Embed" ProgID="Word.Document.12" ShapeID="_x0000_i1030" DrawAspect="Content" ObjectID="_1807448648" r:id="rId7">
+          <o:OLEObject Type="Embed" ProgID="Word.Document.12" ShapeID="_x0000_i1029" DrawAspect="Content" ObjectID="_1809523980" r:id="rId7">
             <o:FieldCodes>\s</o:FieldCodes>
           </o:OLEObject>
         </w:object>

</xml_diff>